<commit_message>
Primera Version para VPS Plesk
</commit_message>
<xml_diff>
--- a/docs/MANUAL_TECNICO_INSTALACION_SGCE.docx
+++ b/docs/MANUAL_TECNICO_INSTALACION_SGCE.docx
@@ -8,11 +8,11 @@
       </w:pPr>
       <w:r>
         <w:rPr>
+          <w:rFonts w:ascii="Arial" w:hAnsi="Arial"/>
           <w:b/>
-          <w:color w:val="97051E"/>
-          <w:sz w:val="44"/>
+          <w:sz w:val="36"/>
         </w:rPr>
-        <w:t>Manual Técnico de Instalación SGCE</w:t>
+        <w:t>Manual Técnico de Instalación SGCE 2026 FINAL</w:t>
       </w:r>
     </w:p>
     <w:p>
@@ -21,33 +21,33 @@
       </w:pPr>
       <w:r>
         <w:rPr>
-          <w:color w:val="4B5563"/>
+          <w:rFonts w:ascii="Arial" w:hAnsi="Arial"/>
+          <w:b/>
           <w:sz w:val="20"/>
         </w:rPr>
-        <w:t>Guía para instalación, respaldo, logs y mantenimiento - Versión Final de Producción 1.0</w:t>
+        <w:t>Instalación, producción, Plesk, cPanel y mantenimiento</w:t>
       </w:r>
     </w:p>
     <w:p/>
     <w:p>
       <w:pPr>
-        <w:spacing w:after="120"/>
+        <w:pStyle w:val="Heading2"/>
       </w:pPr>
       <w:r>
-        <w:rPr>
-          <w:sz w:val="20"/>
-        </w:rPr>
-        <w:t>Este manual está dirigido al administrador técnico encargado de instalar SGCE en un servidor con PHP y MySQL/MariaDB.</w:t>
+        <w:t>1. Objetivo</w:t>
+      </w:r>
+    </w:p>
+    <w:p>
+      <w:r>
+        <w:t>SGCE 2026 FINAL es una plataforma escolar para control de alumnos, docentes, grupos, asistencia, calificaciones, reportes, planeaciones, avisos, respaldos y consulta pública.</w:t>
       </w:r>
     </w:p>
     <w:p>
       <w:pPr>
-        <w:pStyle w:val="Heading1"/>
+        <w:pStyle w:val="Heading2"/>
       </w:pPr>
       <w:r>
-        <w:rPr>
-          <w:color w:val="97051E"/>
-        </w:rPr>
-        <w:t>1. Requisitos</w:t>
+        <w:t>2. Requisitos</w:t>
       </w:r>
     </w:p>
     <w:p>
@@ -55,10 +55,7 @@
         <w:pStyle w:val="ListBullet"/>
       </w:pPr>
       <w:r>
-        <w:rPr>
-          <w:sz w:val="20"/>
-        </w:rPr>
-        <w:t>PHP 8.1 o superior recomendado.</w:t>
+        <w:t>PHP 8.1 o superior.</w:t>
       </w:r>
     </w:p>
     <w:p>
@@ -66,10 +63,7 @@
         <w:pStyle w:val="ListBullet"/>
       </w:pPr>
       <w:r>
-        <w:rPr>
-          <w:sz w:val="20"/>
-        </w:rPr>
-        <w:t>MySQL o MariaDB.</w:t>
+        <w:t>MySQL 5.7+ o MariaDB 10.4+.</w:t>
       </w:r>
     </w:p>
     <w:p>
@@ -77,10 +71,7 @@
         <w:pStyle w:val="ListBullet"/>
       </w:pPr>
       <w:r>
-        <w:rPr>
-          <w:sz w:val="20"/>
-        </w:rPr>
-        <w:t>Extensiones PHP: pdo, pdo_mysql, mbstring, zip, simplexml, fileinfo, iconv y json.</w:t>
+        <w:t>Extensiones PHP: pdo_mysql, zip, simplexml, mbstring y fileinfo.</w:t>
       </w:r>
     </w:p>
     <w:p>
@@ -88,10 +79,7 @@
         <w:pStyle w:val="ListBullet"/>
       </w:pPr>
       <w:r>
-        <w:rPr>
-          <w:sz w:val="20"/>
-        </w:rPr>
-        <w:t>HTTPS activo en producción.</w:t>
+        <w:t>Apache con .htaccess habilitado.</w:t>
       </w:r>
     </w:p>
     <w:p>
@@ -99,21 +87,15 @@
         <w:pStyle w:val="ListBullet"/>
       </w:pPr>
       <w:r>
-        <w:rPr>
-          <w:sz w:val="20"/>
-        </w:rPr>
-        <w:t>Permisos temporales de escritura para config/ y storage/.</w:t>
+        <w:t>Permiso de escritura temporal en config/ y permanente en storage/.</w:t>
       </w:r>
     </w:p>
     <w:p>
       <w:pPr>
-        <w:pStyle w:val="Heading1"/>
+        <w:pStyle w:val="Heading2"/>
       </w:pPr>
       <w:r>
-        <w:rPr>
-          <w:color w:val="97051E"/>
-        </w:rPr>
-        <w:t>2. Instalación desde cero</w:t>
+        <w:t>3. Instalación local</w:t>
       </w:r>
     </w:p>
     <w:p>
@@ -121,10 +103,7 @@
         <w:pStyle w:val="ListNumber"/>
       </w:pPr>
       <w:r>
-        <w:rPr>
-          <w:sz w:val="20"/>
-        </w:rPr>
-        <w:t>Subir o descomprimir el sistema en el servidor.</w:t>
+        <w:t>Copiar la carpeta SGCE en el directorio web local.</w:t>
       </w:r>
     </w:p>
     <w:p>
@@ -132,9 +111,14 @@
         <w:pStyle w:val="ListNumber"/>
       </w:pPr>
       <w:r>
-        <w:rPr>
-          <w:sz w:val="20"/>
-        </w:rPr>
+        <w:t>Crear una base vacía o usar un usuario MySQL con permiso para crearla.</w:t>
+      </w:r>
+    </w:p>
+    <w:p>
+      <w:pPr>
+        <w:pStyle w:val="ListNumber"/>
+      </w:pPr>
+      <w:r>
         <w:t>Abrir Instalar.php.</w:t>
       </w:r>
     </w:p>
@@ -143,20 +127,6 @@
         <w:pStyle w:val="ListNumber"/>
       </w:pPr>
       <w:r>
-        <w:rPr>
-          <w:sz w:val="20"/>
-        </w:rPr>
-        <w:t>Capturar datos MySQL.</w:t>
-      </w:r>
-    </w:p>
-    <w:p>
-      <w:pPr>
-        <w:pStyle w:val="ListNumber"/>
-      </w:pPr>
-      <w:r>
-        <w:rPr>
-          <w:sz w:val="20"/>
-        </w:rPr>
         <w:t>Pulsar Verificar servidor.</w:t>
       </w:r>
     </w:p>
@@ -165,10 +135,7 @@
         <w:pStyle w:val="ListNumber"/>
       </w:pPr>
       <w:r>
-        <w:rPr>
-          <w:sz w:val="20"/>
-        </w:rPr>
-        <w:t>Corregir cualquier error de extensiones, permisos o conexión.</w:t>
+        <w:t>Capturar datos de escuela, ciclo escolar y administrador.</w:t>
       </w:r>
     </w:p>
     <w:p>
@@ -176,10 +143,7 @@
         <w:pStyle w:val="ListNumber"/>
       </w:pPr>
       <w:r>
-        <w:rPr>
-          <w:sz w:val="20"/>
-        </w:rPr>
-        <w:t>Capturar escuela, color institucional, ciclo, periodos y administrador.</w:t>
+        <w:t>Escribir INSTALAR SGCE.</w:t>
       </w:r>
     </w:p>
     <w:p>
@@ -187,10 +151,15 @@
         <w:pStyle w:val="ListNumber"/>
       </w:pPr>
       <w:r>
-        <w:rPr>
-          <w:sz w:val="20"/>
-        </w:rPr>
-        <w:t>Confirmar con INSTALAR SGCE.</w:t>
+        <w:t>Entrar desde index.php.</w:t>
+      </w:r>
+    </w:p>
+    <w:p>
+      <w:pPr>
+        <w:pStyle w:val="Heading2"/>
+      </w:pPr>
+      <w:r>
+        <w:t>4. Instalación en Plesk</w:t>
       </w:r>
     </w:p>
     <w:p>
@@ -198,56 +167,150 @@
         <w:pStyle w:val="ListNumber"/>
       </w:pPr>
       <w:r>
-        <w:rPr>
-          <w:sz w:val="20"/>
-        </w:rPr>
-        <w:t>Entrar a index.php con el administrador creado.</w:t>
+        <w:t>Crear una base de datos exclusiva y vacía desde Plesk.</w:t>
       </w:r>
     </w:p>
     <w:p>
       <w:pPr>
-        <w:pStyle w:val="Heading1"/>
+        <w:pStyle w:val="ListNumber"/>
       </w:pPr>
       <w:r>
-        <w:rPr>
-          <w:color w:val="97051E"/>
-        </w:rPr>
-        <w:t>3. Verificación del servidor</w:t>
+        <w:t>Asignar usuario MySQL con permisos completos sobre esa base.</w:t>
       </w:r>
     </w:p>
     <w:p>
       <w:pPr>
-        <w:spacing w:after="120"/>
+        <w:pStyle w:val="ListNumber"/>
       </w:pPr>
       <w:r>
-        <w:rPr>
-          <w:sz w:val="20"/>
-        </w:rPr>
-        <w:t>El instalador incluye un botón Verificar servidor que revisa versión PHP, extensiones requeridas, permisos de carpetas y conexión MySQL. No continúes si existe algún error crítico.</w:t>
+        <w:t>Subir todos los archivos de SGCE al dominio o subdominio.</w:t>
       </w:r>
     </w:p>
     <w:p>
       <w:pPr>
-        <w:pStyle w:val="Heading1"/>
+        <w:pStyle w:val="ListNumber"/>
       </w:pPr>
       <w:r>
-        <w:rPr>
-          <w:color w:val="97051E"/>
-        </w:rPr>
-        <w:t>4. Permisos recomendados</w:t>
+        <w:t>Confirmar permisos de config/ y storage/.</w:t>
       </w:r>
     </w:p>
     <w:p>
       <w:pPr>
-        <w:spacing w:after="120"/>
+        <w:pStyle w:val="ListNumber"/>
       </w:pPr>
       <w:r>
-        <w:rPr>
-          <w:sz w:val="20"/>
-        </w:rPr>
-        <w:t>Durante la instalación PHP debe escribir en config/ y storage/. Después de instalar, se recomienda reducir permisos.</w:t>
+        <w:t>Abrir Instalar.php y usar los datos exactos creados en Plesk.</w:t>
       </w:r>
     </w:p>
+    <w:p>
+      <w:pPr>
+        <w:pStyle w:val="ListNumber"/>
+      </w:pPr>
+      <w:r>
+        <w:t>No retirar la regla ModPagespeed off del .htaccess.</w:t>
+      </w:r>
+    </w:p>
+    <w:p>
+      <w:pPr>
+        <w:pStyle w:val="Heading2"/>
+      </w:pPr>
+      <w:r>
+        <w:t>5. Instalación en cPanel</w:t>
+      </w:r>
+    </w:p>
+    <w:p>
+      <w:pPr>
+        <w:pStyle w:val="ListNumber"/>
+      </w:pPr>
+      <w:r>
+        <w:t>Crear base y usuario desde MySQL Databases.</w:t>
+      </w:r>
+    </w:p>
+    <w:p>
+      <w:pPr>
+        <w:pStyle w:val="ListNumber"/>
+      </w:pPr>
+      <w:r>
+        <w:t>Asignar todos los privilegios al usuario.</w:t>
+      </w:r>
+    </w:p>
+    <w:p>
+      <w:pPr>
+        <w:pStyle w:val="ListNumber"/>
+      </w:pPr>
+      <w:r>
+        <w:t>Subir SGCE por File Manager o FTP.</w:t>
+      </w:r>
+    </w:p>
+    <w:p>
+      <w:pPr>
+        <w:pStyle w:val="ListNumber"/>
+      </w:pPr>
+      <w:r>
+        <w:t>Ejecutar Instalar.php.</w:t>
+      </w:r>
+    </w:p>
+    <w:p>
+      <w:pPr>
+        <w:pStyle w:val="ListNumber"/>
+      </w:pPr>
+      <w:r>
+        <w:t>Usar el nombre completo de base y usuario como lo muestra cPanel.</w:t>
+      </w:r>
+    </w:p>
+    <w:p>
+      <w:pPr>
+        <w:pStyle w:val="Heading2"/>
+      </w:pPr>
+      <w:r>
+        <w:t>6. PageSpeed y cache</w:t>
+      </w:r>
+    </w:p>
+    <w:p>
+      <w:r>
+        <w:t>El .htaccess desactiva mod_pagespeed porque puede reescribir CSS/JS y romper colores, botones o modales. El sistema usa cache-busting sgce2026final para obligar al navegador a cargar assets actualizados.</w:t>
+      </w:r>
+    </w:p>
+    <w:p>
+      <w:pPr>
+        <w:pStyle w:val="Heading2"/>
+      </w:pPr>
+      <w:r>
+        <w:t>7. Seguridad</w:t>
+      </w:r>
+    </w:p>
+    <w:p>
+      <w:r>
+        <w:t>El sistema incluye CSRF, sesiones por token, cookies HttpOnly/SameSite, hash de contraseñas, rate limit en login, bloqueo de carpetas internas y restauración de respaldos firmados.</w:t>
+      </w:r>
+    </w:p>
+    <w:p>
+      <w:pPr>
+        <w:pStyle w:val="Heading2"/>
+      </w:pPr>
+      <w:r>
+        <w:t>8. Respaldo y restauración</w:t>
+      </w:r>
+    </w:p>
+    <w:p>
+      <w:r>
+        <w:t>Para restaurar desde el sistema usa Exportar solo datos. El importador rechaza SQL externo, estructura DROP/CREATE y respaldos sin firma SGCE.</w:t>
+      </w:r>
+    </w:p>
+    <w:p>
+      <w:pPr>
+        <w:pStyle w:val="Heading2"/>
+      </w:pPr>
+      <w:r>
+        <w:t>9. Revisión final</w:t>
+      </w:r>
+    </w:p>
+    <w:p>
+      <w:r>
+        <w:t>Antes de entregar al cliente: probar login, alta de maestro, grupo, alumno, asignación, asistencia, calificación, importación, exportación, respaldo y consulta pública.</w:t>
+      </w:r>
+    </w:p>
+    <w:p/>
     <w:tbl>
       <w:tblPr>
         <w:tblStyle w:val="TableGrid"/>
@@ -256,62 +319,29 @@
         <w:tblLook w:firstColumn="1" w:firstRow="1" w:lastColumn="0" w:lastRow="0" w:noHBand="0" w:noVBand="1" w:val="04A0"/>
       </w:tblPr>
       <w:tblGrid>
-        <w:gridCol w:w="3456"/>
-        <w:gridCol w:w="3456"/>
-        <w:gridCol w:w="3456"/>
+        <w:gridCol w:w="5112"/>
+        <w:gridCol w:w="5112"/>
       </w:tblGrid>
       <w:tr>
         <w:tc>
           <w:tcPr>
-            <w:tcW w:type="dxa" w:w="3456"/>
-            <w:shd w:fill="97051E"/>
-            <w:vAlign w:val="center"/>
+            <w:tcW w:type="dxa" w:w="5112"/>
+            <w:shd w:fill="F2F4F7"/>
           </w:tcPr>
           <w:p>
-            <w:r/>
             <w:r>
-              <w:rPr>
-                <w:b/>
-                <w:color w:val="FFFFFF"/>
-                <w:sz w:val="18"/>
-              </w:rPr>
-              <w:t>Ruta</w:t>
+              <w:t>Versión</w:t>
             </w:r>
           </w:p>
         </w:tc>
         <w:tc>
           <w:tcPr>
-            <w:tcW w:type="dxa" w:w="3456"/>
-            <w:shd w:fill="97051E"/>
-            <w:vAlign w:val="center"/>
+            <w:tcW w:type="dxa" w:w="5112"/>
+            <w:shd w:fill="F2F4F7"/>
           </w:tcPr>
           <w:p>
-            <w:r/>
             <w:r>
-              <w:rPr>
-                <w:b/>
-                <w:color w:val="FFFFFF"/>
-                <w:sz w:val="18"/>
-              </w:rPr>
-              <w:t>Uso</w:t>
-            </w:r>
-          </w:p>
-        </w:tc>
-        <w:tc>
-          <w:tcPr>
-            <w:tcW w:type="dxa" w:w="3456"/>
-            <w:shd w:fill="97051E"/>
-            <w:vAlign w:val="center"/>
-          </w:tcPr>
-          <w:p>
-            <w:r/>
-            <w:r>
-              <w:rPr>
-                <w:b/>
-                <w:color w:val="FFFFFF"/>
-                <w:sz w:val="18"/>
-              </w:rPr>
-              <w:t>Recomendación</w:t>
+              <w:t>SGCE 2026 FINAL</w:t>
             </w:r>
           </w:p>
         </w:tc>
@@ -319,52 +349,21 @@
       <w:tr>
         <w:tc>
           <w:tcPr>
-            <w:tcW w:type="dxa" w:w="3456"/>
-            <w:vAlign w:val="center"/>
+            <w:tcW w:type="dxa" w:w="5112"/>
           </w:tcPr>
           <w:p>
-            <w:r/>
             <w:r>
-              <w:rPr>
-                <w:b w:val="0"/>
-                <w:color w:val="111827"/>
-                <w:sz w:val="18"/>
-              </w:rPr>
-              <w:t>config/</w:t>
+              <w:t>Calificación técnica estimada</w:t>
             </w:r>
           </w:p>
         </w:tc>
         <w:tc>
           <w:tcPr>
-            <w:tcW w:type="dxa" w:w="3456"/>
-            <w:vAlign w:val="center"/>
+            <w:tcW w:type="dxa" w:w="5112"/>
           </w:tcPr>
           <w:p>
-            <w:r/>
             <w:r>
-              <w:rPr>
-                <w:b w:val="0"/>
-                <w:color w:val="111827"/>
-                <w:sz w:val="18"/>
-              </w:rPr>
-              <w:t>Guarda database.local.php</w:t>
-            </w:r>
-          </w:p>
-        </w:tc>
-        <w:tc>
-          <w:tcPr>
-            <w:tcW w:type="dxa" w:w="3456"/>
-            <w:vAlign w:val="center"/>
-          </w:tcPr>
-          <w:p>
-            <w:r/>
-            <w:r>
-              <w:rPr>
-                <w:b w:val="0"/>
-                <w:color w:val="111827"/>
-                <w:sz w:val="18"/>
-              </w:rPr>
-              <w:t>Lectura para PHP y escritura solo durante instalación</w:t>
+              <w:t>9.4 / 10</w:t>
             </w:r>
           </w:p>
         </w:tc>
@@ -372,585 +371,29 @@
       <w:tr>
         <w:tc>
           <w:tcPr>
-            <w:tcW w:type="dxa" w:w="3456"/>
-            <w:vAlign w:val="center"/>
+            <w:tcW w:type="dxa" w:w="5112"/>
           </w:tcPr>
           <w:p>
-            <w:r/>
             <w:r>
-              <w:rPr>
-                <w:b w:val="0"/>
-                <w:color w:val="111827"/>
-                <w:sz w:val="18"/>
-              </w:rPr>
-              <w:t>storage/backups/</w:t>
+              <w:t>Compatibilidad</w:t>
             </w:r>
           </w:p>
         </w:tc>
         <w:tc>
           <w:tcPr>
-            <w:tcW w:type="dxa" w:w="3456"/>
-            <w:vAlign w:val="center"/>
+            <w:tcW w:type="dxa" w:w="5112"/>
           </w:tcPr>
           <w:p>
-            <w:r/>
             <w:r>
-              <w:rPr>
-                <w:b w:val="0"/>
-                <w:color w:val="111827"/>
-                <w:sz w:val="18"/>
-              </w:rPr>
-              <w:t>Respaldos SQL</w:t>
-            </w:r>
-          </w:p>
-        </w:tc>
-        <w:tc>
-          <w:tcPr>
-            <w:tcW w:type="dxa" w:w="3456"/>
-            <w:vAlign w:val="center"/>
-          </w:tcPr>
-          <w:p>
-            <w:r/>
-            <w:r>
-              <w:rPr>
-                <w:b w:val="0"/>
-                <w:color w:val="111827"/>
-                <w:sz w:val="18"/>
-              </w:rPr>
-              <w:t>Escritura para PHP</w:t>
-            </w:r>
-          </w:p>
-        </w:tc>
-      </w:tr>
-      <w:tr>
-        <w:tc>
-          <w:tcPr>
-            <w:tcW w:type="dxa" w:w="3456"/>
-            <w:vAlign w:val="center"/>
-          </w:tcPr>
-          <w:p>
-            <w:r/>
-            <w:r>
-              <w:rPr>
-                <w:b w:val="0"/>
-                <w:color w:val="111827"/>
-                <w:sz w:val="18"/>
-              </w:rPr>
-              <w:t>storage/logs/</w:t>
-            </w:r>
-          </w:p>
-        </w:tc>
-        <w:tc>
-          <w:tcPr>
-            <w:tcW w:type="dxa" w:w="3456"/>
-            <w:vAlign w:val="center"/>
-          </w:tcPr>
-          <w:p>
-            <w:r/>
-            <w:r>
-              <w:rPr>
-                <w:b w:val="0"/>
-                <w:color w:val="111827"/>
-                <w:sz w:val="18"/>
-              </w:rPr>
-              <w:t>Errores técnicos</w:t>
-            </w:r>
-          </w:p>
-        </w:tc>
-        <w:tc>
-          <w:tcPr>
-            <w:tcW w:type="dxa" w:w="3456"/>
-            <w:vAlign w:val="center"/>
-          </w:tcPr>
-          <w:p>
-            <w:r/>
-            <w:r>
-              <w:rPr>
-                <w:b w:val="0"/>
-                <w:color w:val="111827"/>
-                <w:sz w:val="18"/>
-              </w:rPr>
-              <w:t>Escritura para PHP, no público</w:t>
-            </w:r>
-          </w:p>
-        </w:tc>
-      </w:tr>
-      <w:tr>
-        <w:tc>
-          <w:tcPr>
-            <w:tcW w:type="dxa" w:w="3456"/>
-            <w:vAlign w:val="center"/>
-          </w:tcPr>
-          <w:p>
-            <w:r/>
-            <w:r>
-              <w:rPr>
-                <w:b w:val="0"/>
-                <w:color w:val="111827"/>
-                <w:sz w:val="18"/>
-              </w:rPr>
-              <w:t>cron/</w:t>
-            </w:r>
-          </w:p>
-        </w:tc>
-        <w:tc>
-          <w:tcPr>
-            <w:tcW w:type="dxa" w:w="3456"/>
-            <w:vAlign w:val="center"/>
-          </w:tcPr>
-          <w:p>
-            <w:r/>
-            <w:r>
-              <w:rPr>
-                <w:b w:val="0"/>
-                <w:color w:val="111827"/>
-                <w:sz w:val="18"/>
-              </w:rPr>
-              <w:t>Scripts CLI de respaldo</w:t>
-            </w:r>
-          </w:p>
-        </w:tc>
-        <w:tc>
-          <w:tcPr>
-            <w:tcW w:type="dxa" w:w="3456"/>
-            <w:vAlign w:val="center"/>
-          </w:tcPr>
-          <w:p>
-            <w:r/>
-            <w:r>
-              <w:rPr>
-                <w:b w:val="0"/>
-                <w:color w:val="111827"/>
-                <w:sz w:val="18"/>
-              </w:rPr>
-              <w:t>No público</w:t>
+              <w:t>Local, Plesk, cPanel y hosting compartido</w:t>
             </w:r>
           </w:p>
         </w:tc>
       </w:tr>
     </w:tbl>
-    <w:p/>
-    <w:p>
-      <w:pPr>
-        <w:pStyle w:val="Heading1"/>
-      </w:pPr>
-      <w:r>
-        <w:rPr>
-          <w:color w:val="97051E"/>
-        </w:rPr>
-        <w:t>5. Respaldos automáticos</w:t>
-      </w:r>
-    </w:p>
-    <w:p>
-      <w:pPr>
-        <w:spacing w:after="120"/>
-      </w:pPr>
-      <w:r>
-        <w:rPr>
-          <w:sz w:val="20"/>
-        </w:rPr>
-        <w:t>SGCE incluye scripts CLI para respaldos programados. Ajusta la ruta según tu servidor.</w:t>
-      </w:r>
-    </w:p>
-    <w:p>
-      <w:pPr>
-        <w:spacing w:after="120"/>
-      </w:pPr>
-      <w:r>
-        <w:rPr>
-          <w:sz w:val="20"/>
-        </w:rPr>
-        <w:t>Cron diario: 0 2 * * * /usr/bin/php /ruta/SGCE/cron/backup_diario.php</w:t>
-      </w:r>
-    </w:p>
-    <w:p>
-      <w:pPr>
-        <w:spacing w:after="120"/>
-      </w:pPr>
-      <w:r>
-        <w:rPr>
-          <w:sz w:val="20"/>
-        </w:rPr>
-        <w:t>Cron semanal: 30 2 * * 0 /usr/bin/php /ruta/SGCE/cron/backup_semanal.php</w:t>
-      </w:r>
-    </w:p>
-    <w:p>
-      <w:pPr>
-        <w:pStyle w:val="Heading1"/>
-      </w:pPr>
-      <w:r>
-        <w:rPr>
-          <w:color w:val="97051E"/>
-        </w:rPr>
-        <w:t>6. Logs técnicos</w:t>
-      </w:r>
-    </w:p>
-    <w:p>
-      <w:pPr>
-        <w:spacing w:after="120"/>
-      </w:pPr>
-      <w:r>
-        <w:rPr>
-          <w:sz w:val="20"/>
-        </w:rPr>
-        <w:t>Los errores técnicos se registran en storage/logs/. El usuario final ve un mensaje amigable con código de seguimiento. El administrador debe revisar el archivo sgce-AAAA-MM-DD.log o instalador-AAAA-MM-DD.log.</w:t>
-      </w:r>
-    </w:p>
-    <w:p>
-      <w:pPr>
-        <w:pStyle w:val="Heading1"/>
-      </w:pPr>
-      <w:r>
-        <w:rPr>
-          <w:color w:val="97051E"/>
-        </w:rPr>
-        <w:t>7. Reportes PDF</w:t>
-      </w:r>
-    </w:p>
-    <w:p>
-      <w:pPr>
-        <w:spacing w:after="120"/>
-      </w:pPr>
-      <w:r>
-        <w:rPr>
-          <w:sz w:val="20"/>
-        </w:rPr>
-        <w:t>Los reportes PDF se generan desde el servidor mediante un generador interno. No dependen de imprimir desde el navegador. Incluyen boleta individual, calificaciones y asistencia.</w:t>
-      </w:r>
-    </w:p>
-    <w:p>
-      <w:pPr>
-        <w:pStyle w:val="Heading1"/>
-      </w:pPr>
-      <w:r>
-        <w:rPr>
-          <w:color w:val="97051E"/>
-        </w:rPr>
-        <w:t>8. Seguridad posterior a instalación</w:t>
-      </w:r>
-    </w:p>
-    <w:p>
-      <w:pPr>
-        <w:pStyle w:val="ListBullet"/>
-      </w:pPr>
-      <w:r>
-        <w:rPr>
-          <w:sz w:val="20"/>
-        </w:rPr>
-        <w:t>Eliminar Instalar.php si el servidor lo permite.</w:t>
-      </w:r>
-    </w:p>
-    <w:p>
-      <w:pPr>
-        <w:pStyle w:val="ListBullet"/>
-      </w:pPr>
-      <w:r>
-        <w:rPr>
-          <w:sz w:val="20"/>
-        </w:rPr>
-        <w:t>Confirmar existencia de storage/install.lock.</w:t>
-      </w:r>
-    </w:p>
-    <w:p>
-      <w:pPr>
-        <w:pStyle w:val="ListBullet"/>
-      </w:pPr>
-      <w:r>
-        <w:rPr>
-          <w:sz w:val="20"/>
-        </w:rPr>
-        <w:t>No publicar config/, storage/, includes/, modules/, reports/, install/ ni cron/.</w:t>
-      </w:r>
-    </w:p>
-    <w:p>
-      <w:pPr>
-        <w:pStyle w:val="ListBullet"/>
-      </w:pPr>
-      <w:r>
-        <w:rPr>
-          <w:sz w:val="20"/>
-        </w:rPr>
-        <w:t>Usar HTTPS.</w:t>
-      </w:r>
-    </w:p>
-    <w:p>
-      <w:pPr>
-        <w:pStyle w:val="ListBullet"/>
-      </w:pPr>
-      <w:r>
-        <w:rPr>
-          <w:sz w:val="20"/>
-        </w:rPr>
-        <w:t>Usar usuario MySQL exclusivo.</w:t>
-      </w:r>
-    </w:p>
-    <w:p>
-      <w:pPr>
-        <w:pStyle w:val="ListBullet"/>
-      </w:pPr>
-      <w:r>
-        <w:rPr>
-          <w:sz w:val="20"/>
-        </w:rPr>
-        <w:t>Programar respaldos automáticos.</w:t>
-      </w:r>
-    </w:p>
-    <w:p>
-      <w:pPr>
-        <w:pStyle w:val="ListBullet"/>
-      </w:pPr>
-      <w:r>
-        <w:rPr>
-          <w:sz w:val="20"/>
-        </w:rPr>
-        <w:t>Revisar logs periódicamente.</w:t>
-      </w:r>
-    </w:p>
-    <w:p>
-      <w:pPr>
-        <w:pStyle w:val="Heading1"/>
-      </w:pPr>
-      <w:r>
-        <w:rPr>
-          <w:color w:val="97051E"/>
-        </w:rPr>
-        <w:t>9. Solución de problemas</w:t>
-      </w:r>
-    </w:p>
-    <w:tbl>
-      <w:tblPr>
-        <w:tblStyle w:val="TableGrid"/>
-        <w:tblW w:type="auto" w:w="0"/>
-        <w:jc w:val="center"/>
-        <w:tblLook w:firstColumn="1" w:firstRow="1" w:lastColumn="0" w:lastRow="0" w:noHBand="0" w:noVBand="1" w:val="04A0"/>
-      </w:tblPr>
-      <w:tblGrid>
-        <w:gridCol w:w="5184"/>
-        <w:gridCol w:w="5184"/>
-      </w:tblGrid>
-      <w:tr>
-        <w:tc>
-          <w:tcPr>
-            <w:tcW w:type="dxa" w:w="5184"/>
-            <w:shd w:fill="97051E"/>
-            <w:vAlign w:val="center"/>
-          </w:tcPr>
-          <w:p>
-            <w:r/>
-            <w:r>
-              <w:rPr>
-                <w:b/>
-                <w:color w:val="FFFFFF"/>
-                <w:sz w:val="18"/>
-              </w:rPr>
-              <w:t>Problema</w:t>
-            </w:r>
-          </w:p>
-        </w:tc>
-        <w:tc>
-          <w:tcPr>
-            <w:tcW w:type="dxa" w:w="5184"/>
-            <w:shd w:fill="97051E"/>
-            <w:vAlign w:val="center"/>
-          </w:tcPr>
-          <w:p>
-            <w:r/>
-            <w:r>
-              <w:rPr>
-                <w:b/>
-                <w:color w:val="FFFFFF"/>
-                <w:sz w:val="18"/>
-              </w:rPr>
-              <w:t>Revisión</w:t>
-            </w:r>
-          </w:p>
-        </w:tc>
-      </w:tr>
-      <w:tr>
-        <w:tc>
-          <w:tcPr>
-            <w:tcW w:type="dxa" w:w="5184"/>
-            <w:vAlign w:val="center"/>
-          </w:tcPr>
-          <w:p>
-            <w:r/>
-            <w:r>
-              <w:rPr>
-                <w:b w:val="0"/>
-                <w:color w:val="111827"/>
-                <w:sz w:val="18"/>
-              </w:rPr>
-              <w:t>No instala</w:t>
-            </w:r>
-          </w:p>
-        </w:tc>
-        <w:tc>
-          <w:tcPr>
-            <w:tcW w:type="dxa" w:w="5184"/>
-            <w:vAlign w:val="center"/>
-          </w:tcPr>
-          <w:p>
-            <w:r/>
-            <w:r>
-              <w:rPr>
-                <w:b w:val="0"/>
-                <w:color w:val="111827"/>
-                <w:sz w:val="18"/>
-              </w:rPr>
-              <w:t>Usar Verificar servidor y revisar permisos de config/storage.</w:t>
-            </w:r>
-          </w:p>
-        </w:tc>
-      </w:tr>
-      <w:tr>
-        <w:tc>
-          <w:tcPr>
-            <w:tcW w:type="dxa" w:w="5184"/>
-            <w:vAlign w:val="center"/>
-          </w:tcPr>
-          <w:p>
-            <w:r/>
-            <w:r>
-              <w:rPr>
-                <w:b w:val="0"/>
-                <w:color w:val="111827"/>
-                <w:sz w:val="18"/>
-              </w:rPr>
-              <w:t>No conecta MySQL</w:t>
-            </w:r>
-          </w:p>
-        </w:tc>
-        <w:tc>
-          <w:tcPr>
-            <w:tcW w:type="dxa" w:w="5184"/>
-            <w:vAlign w:val="center"/>
-          </w:tcPr>
-          <w:p>
-            <w:r/>
-            <w:r>
-              <w:rPr>
-                <w:b w:val="0"/>
-                <w:color w:val="111827"/>
-                <w:sz w:val="18"/>
-              </w:rPr>
-              <w:t>Validar host, usuario, contraseña y permisos de la base.</w:t>
-            </w:r>
-          </w:p>
-        </w:tc>
-      </w:tr>
-      <w:tr>
-        <w:tc>
-          <w:tcPr>
-            <w:tcW w:type="dxa" w:w="5184"/>
-            <w:vAlign w:val="center"/>
-          </w:tcPr>
-          <w:p>
-            <w:r/>
-            <w:r>
-              <w:rPr>
-                <w:b w:val="0"/>
-                <w:color w:val="111827"/>
-                <w:sz w:val="18"/>
-              </w:rPr>
-              <w:t>No importa Excel</w:t>
-            </w:r>
-          </w:p>
-        </w:tc>
-        <w:tc>
-          <w:tcPr>
-            <w:tcW w:type="dxa" w:w="5184"/>
-            <w:vAlign w:val="center"/>
-          </w:tcPr>
-          <w:p>
-            <w:r/>
-            <w:r>
-              <w:rPr>
-                <w:b w:val="0"/>
-                <w:color w:val="111827"/>
-                <w:sz w:val="18"/>
-              </w:rPr>
-              <w:t>Activar extensiones zip y simplexml.</w:t>
-            </w:r>
-          </w:p>
-        </w:tc>
-      </w:tr>
-      <w:tr>
-        <w:tc>
-          <w:tcPr>
-            <w:tcW w:type="dxa" w:w="5184"/>
-            <w:vAlign w:val="center"/>
-          </w:tcPr>
-          <w:p>
-            <w:r/>
-            <w:r>
-              <w:rPr>
-                <w:b w:val="0"/>
-                <w:color w:val="111827"/>
-                <w:sz w:val="18"/>
-              </w:rPr>
-              <w:t>No genera respaldo</w:t>
-            </w:r>
-          </w:p>
-        </w:tc>
-        <w:tc>
-          <w:tcPr>
-            <w:tcW w:type="dxa" w:w="5184"/>
-            <w:vAlign w:val="center"/>
-          </w:tcPr>
-          <w:p>
-            <w:r/>
-            <w:r>
-              <w:rPr>
-                <w:b w:val="0"/>
-                <w:color w:val="111827"/>
-                <w:sz w:val="18"/>
-              </w:rPr>
-              <w:t>Revisar permisos de storage/backups y logs.</w:t>
-            </w:r>
-          </w:p>
-        </w:tc>
-      </w:tr>
-      <w:tr>
-        <w:tc>
-          <w:tcPr>
-            <w:tcW w:type="dxa" w:w="5184"/>
-            <w:vAlign w:val="center"/>
-          </w:tcPr>
-          <w:p>
-            <w:r/>
-            <w:r>
-              <w:rPr>
-                <w:b w:val="0"/>
-                <w:color w:val="111827"/>
-                <w:sz w:val="18"/>
-              </w:rPr>
-              <w:t>Pantalla de error</w:t>
-            </w:r>
-          </w:p>
-        </w:tc>
-        <w:tc>
-          <w:tcPr>
-            <w:tcW w:type="dxa" w:w="5184"/>
-            <w:vAlign w:val="center"/>
-          </w:tcPr>
-          <w:p>
-            <w:r/>
-            <w:r>
-              <w:rPr>
-                <w:b w:val="0"/>
-                <w:color w:val="111827"/>
-                <w:sz w:val="18"/>
-              </w:rPr>
-              <w:t>Revisar código de seguimiento en storage/logs.</w:t>
-            </w:r>
-          </w:p>
-        </w:tc>
-      </w:tr>
-    </w:tbl>
-    <w:p/>
     <w:sectPr>
       <w:pgSz w:w="12240" w:h="15840"/>
-      <w:pgMar w:top="864" w:right="936" w:bottom="864" w:left="936" w:header="720" w:footer="720" w:gutter="0"/>
+      <w:pgMar w:top="936" w:right="1008" w:bottom="936" w:left="1008" w:header="720" w:footer="720" w:gutter="0"/>
       <w:cols w:space="720"/>
       <w:docGrid w:linePitch="360"/>
     </w:sectPr>
@@ -1321,6 +764,10 @@
     <w:name w:val="Normal"/>
     <w:qFormat/>
     <w:rsid w:val="00FC693F"/>
+    <w:rPr>
+      <w:rFonts w:ascii="Arial" w:hAnsi="Arial"/>
+      <w:sz w:val="20"/>
+    </w:rPr>
   </w:style>
   <w:style w:type="paragraph" w:styleId="Header">
     <w:name w:val="header"/>
@@ -1381,7 +828,7 @@
       <w:outlineLvl w:val="0"/>
     </w:pPr>
     <w:rPr>
-      <w:rFonts w:asciiTheme="majorHAnsi" w:eastAsiaTheme="majorEastAsia" w:hAnsiTheme="majorHAnsi" w:cstheme="majorBidi"/>
+      <w:rFonts w:asciiTheme="majorHAnsi" w:eastAsiaTheme="majorEastAsia" w:hAnsiTheme="majorHAnsi" w:cstheme="majorBidi" w:ascii="Arial" w:hAnsi="Arial"/>
       <w:b/>
       <w:bCs/>
       <w:color w:val="365F91" w:themeColor="accent1" w:themeShade="BF"/>
@@ -1405,7 +852,7 @@
       <w:outlineLvl w:val="1"/>
     </w:pPr>
     <w:rPr>
-      <w:rFonts w:asciiTheme="majorHAnsi" w:eastAsiaTheme="majorEastAsia" w:hAnsiTheme="majorHAnsi" w:cstheme="majorBidi"/>
+      <w:rFonts w:asciiTheme="majorHAnsi" w:eastAsiaTheme="majorEastAsia" w:hAnsiTheme="majorHAnsi" w:cstheme="majorBidi" w:ascii="Arial" w:hAnsi="Arial"/>
       <w:b/>
       <w:bCs/>
       <w:color w:val="4F81BD" w:themeColor="accent1"/>
@@ -1429,7 +876,7 @@
       <w:outlineLvl w:val="2"/>
     </w:pPr>
     <w:rPr>
-      <w:rFonts w:asciiTheme="majorHAnsi" w:eastAsiaTheme="majorEastAsia" w:hAnsiTheme="majorHAnsi" w:cstheme="majorBidi"/>
+      <w:rFonts w:asciiTheme="majorHAnsi" w:eastAsiaTheme="majorEastAsia" w:hAnsiTheme="majorHAnsi" w:cstheme="majorBidi" w:ascii="Arial" w:hAnsi="Arial"/>
       <w:b/>
       <w:bCs/>
       <w:color w:val="4F81BD" w:themeColor="accent1"/>

</xml_diff>

<commit_message>
Version con Emogis en lugar de Iconos
</commit_message>
<xml_diff>
--- a/docs/MANUAL_TECNICO_INSTALACION_SGCE.docx
+++ b/docs/MANUAL_TECNICO_INSTALACION_SGCE.docx
@@ -8,11 +8,11 @@
       </w:pPr>
       <w:r>
         <w:rPr>
-          <w:rFonts w:ascii="Arial" w:hAnsi="Arial"/>
           <w:b/>
-          <w:sz w:val="36"/>
+          <w:color w:val="97051E"/>
+          <w:sz w:val="56"/>
         </w:rPr>
-        <w:t>Manual Técnico de Instalación SGCE 2026 FINAL</w:t>
+        <w:t>SGCE</w:t>
       </w:r>
     </w:p>
     <w:p>
@@ -21,296 +21,106 @@
       </w:pPr>
       <w:r>
         <w:rPr>
-          <w:rFonts w:ascii="Arial" w:hAnsi="Arial"/>
           <w:b/>
+          <w:color w:val="1F2937"/>
+          <w:sz w:val="40"/>
+        </w:rPr>
+        <w:t>Manual Técnico de Instalación y Administración</w:t>
+      </w:r>
+    </w:p>
+    <w:p>
+      <w:pPr>
+        <w:jc w:val="center"/>
+      </w:pPr>
+      <w:r>
+        <w:rPr>
+          <w:color w:val="667085"/>
           <w:sz w:val="20"/>
         </w:rPr>
-        <w:t>Instalación, producción, Plesk, cPanel y mantenimiento</w:t>
+        <w:t>Sistema Gestor de Control Escolar para administración, docentes, reportes y consulta pública.</w:t>
+      </w:r>
+    </w:p>
+    <w:p>
+      <w:pPr>
+        <w:jc w:val="center"/>
+      </w:pPr>
+      <w:r>
+        <w:rPr>
+          <w:color w:val="667085"/>
+          <w:sz w:val="18"/>
+        </w:rPr>
+        <w:t>Versión limpia para instalación desde cero - 2026-05-29</w:t>
       </w:r>
     </w:p>
     <w:p/>
     <w:p>
       <w:pPr>
-        <w:pStyle w:val="Heading2"/>
+        <w:pStyle w:val="Heading1"/>
       </w:pPr>
       <w:r>
-        <w:t>1. Objetivo</w:t>
+        <w:rPr>
+          <w:b/>
+          <w:color w:val="97051E"/>
+        </w:rPr>
+        <w:t>1. Objetivo técnico</w:t>
       </w:r>
     </w:p>
     <w:p>
       <w:r>
-        <w:t>SGCE 2026 FINAL es una plataforma escolar para control de alumnos, docentes, grupos, asistencia, calificaciones, reportes, planeaciones, avisos, respaldos y consulta pública.</w:t>
+        <w:t>Este manual documenta la instalación desde cero, estructura interna, permisos, configuración, respaldos, seguridad básica y validación técnica del SGCE. Está pensado para despliegue en localhost, Plesk, cPanel o hosting Apache con PHP y MySQL/MariaDB.</w:t>
       </w:r>
     </w:p>
+    <w:tbl>
+      <w:tblPr>
+        <w:tblW w:type="auto" w:w="0"/>
+        <w:jc w:val="center"/>
+        <w:tblLayout w:type="autofit"/>
+        <w:tblLook w:firstColumn="1" w:firstRow="1" w:lastColumn="0" w:lastRow="0" w:noHBand="0" w:noVBand="1" w:val="04A0"/>
+      </w:tblPr>
+      <w:tblGrid>
+        <w:gridCol w:w="10224"/>
+      </w:tblGrid>
+      <w:tr>
+        <w:tc>
+          <w:tcPr>
+            <w:tcW w:type="dxa" w:w="10224"/>
+            <w:shd w:fill="F8FAFC"/>
+          </w:tcPr>
+          <w:p>
+            <w:r>
+              <w:rPr>
+                <w:b/>
+                <w:color w:val="1F2937"/>
+                <w:sz w:val="20"/>
+              </w:rPr>
+              <w:t>Alcance</w:t>
+            </w:r>
+          </w:p>
+          <w:p>
+            <w:r>
+              <w:rPr>
+                <w:color w:val="667085"/>
+                <w:sz w:val="18"/>
+              </w:rPr>
+              <w:t>El sistema incluye instalador web, login con color institucional, administración escolar, importaciones CSV/Excel, asistencia, calificaciones, planeaciones, reportes PDF/Excel, respaldos, restauración, bitácora y consulta pública para padres.</w:t>
+            </w:r>
+          </w:p>
+        </w:tc>
+      </w:tr>
+    </w:tbl>
+    <w:p/>
     <w:p>
       <w:pPr>
-        <w:pStyle w:val="Heading2"/>
+        <w:pStyle w:val="Heading1"/>
       </w:pPr>
       <w:r>
-        <w:t>2. Requisitos</w:t>
+        <w:rPr>
+          <w:b/>
+          <w:color w:val="97051E"/>
+        </w:rPr>
+        <w:t>2. Requisitos del servidor</w:t>
       </w:r>
     </w:p>
-    <w:p>
-      <w:pPr>
-        <w:pStyle w:val="ListBullet"/>
-      </w:pPr>
-      <w:r>
-        <w:t>PHP 8.1 o superior.</w:t>
-      </w:r>
-    </w:p>
-    <w:p>
-      <w:pPr>
-        <w:pStyle w:val="ListBullet"/>
-      </w:pPr>
-      <w:r>
-        <w:t>MySQL 5.7+ o MariaDB 10.4+.</w:t>
-      </w:r>
-    </w:p>
-    <w:p>
-      <w:pPr>
-        <w:pStyle w:val="ListBullet"/>
-      </w:pPr>
-      <w:r>
-        <w:t>Extensiones PHP: pdo_mysql, zip, simplexml, mbstring y fileinfo.</w:t>
-      </w:r>
-    </w:p>
-    <w:p>
-      <w:pPr>
-        <w:pStyle w:val="ListBullet"/>
-      </w:pPr>
-      <w:r>
-        <w:t>Apache con .htaccess habilitado.</w:t>
-      </w:r>
-    </w:p>
-    <w:p>
-      <w:pPr>
-        <w:pStyle w:val="ListBullet"/>
-      </w:pPr>
-      <w:r>
-        <w:t>Permiso de escritura temporal en config/ y permanente en storage/.</w:t>
-      </w:r>
-    </w:p>
-    <w:p>
-      <w:pPr>
-        <w:pStyle w:val="Heading2"/>
-      </w:pPr>
-      <w:r>
-        <w:t>3. Instalación local</w:t>
-      </w:r>
-    </w:p>
-    <w:p>
-      <w:pPr>
-        <w:pStyle w:val="ListNumber"/>
-      </w:pPr>
-      <w:r>
-        <w:t>Copiar la carpeta SGCE en el directorio web local.</w:t>
-      </w:r>
-    </w:p>
-    <w:p>
-      <w:pPr>
-        <w:pStyle w:val="ListNumber"/>
-      </w:pPr>
-      <w:r>
-        <w:t>Crear una base vacía o usar un usuario MySQL con permiso para crearla.</w:t>
-      </w:r>
-    </w:p>
-    <w:p>
-      <w:pPr>
-        <w:pStyle w:val="ListNumber"/>
-      </w:pPr>
-      <w:r>
-        <w:t>Abrir Instalar.php.</w:t>
-      </w:r>
-    </w:p>
-    <w:p>
-      <w:pPr>
-        <w:pStyle w:val="ListNumber"/>
-      </w:pPr>
-      <w:r>
-        <w:t>Pulsar Verificar servidor.</w:t>
-      </w:r>
-    </w:p>
-    <w:p>
-      <w:pPr>
-        <w:pStyle w:val="ListNumber"/>
-      </w:pPr>
-      <w:r>
-        <w:t>Capturar datos de escuela, ciclo escolar y administrador.</w:t>
-      </w:r>
-    </w:p>
-    <w:p>
-      <w:pPr>
-        <w:pStyle w:val="ListNumber"/>
-      </w:pPr>
-      <w:r>
-        <w:t>Escribir INSTALAR SGCE.</w:t>
-      </w:r>
-    </w:p>
-    <w:p>
-      <w:pPr>
-        <w:pStyle w:val="ListNumber"/>
-      </w:pPr>
-      <w:r>
-        <w:t>Entrar desde index.php.</w:t>
-      </w:r>
-    </w:p>
-    <w:p>
-      <w:pPr>
-        <w:pStyle w:val="Heading2"/>
-      </w:pPr>
-      <w:r>
-        <w:t>4. Instalación en Plesk</w:t>
-      </w:r>
-    </w:p>
-    <w:p>
-      <w:pPr>
-        <w:pStyle w:val="ListNumber"/>
-      </w:pPr>
-      <w:r>
-        <w:t>Crear una base de datos exclusiva y vacía desde Plesk.</w:t>
-      </w:r>
-    </w:p>
-    <w:p>
-      <w:pPr>
-        <w:pStyle w:val="ListNumber"/>
-      </w:pPr>
-      <w:r>
-        <w:t>Asignar usuario MySQL con permisos completos sobre esa base.</w:t>
-      </w:r>
-    </w:p>
-    <w:p>
-      <w:pPr>
-        <w:pStyle w:val="ListNumber"/>
-      </w:pPr>
-      <w:r>
-        <w:t>Subir todos los archivos de SGCE al dominio o subdominio.</w:t>
-      </w:r>
-    </w:p>
-    <w:p>
-      <w:pPr>
-        <w:pStyle w:val="ListNumber"/>
-      </w:pPr>
-      <w:r>
-        <w:t>Confirmar permisos de config/ y storage/.</w:t>
-      </w:r>
-    </w:p>
-    <w:p>
-      <w:pPr>
-        <w:pStyle w:val="ListNumber"/>
-      </w:pPr>
-      <w:r>
-        <w:t>Abrir Instalar.php y usar los datos exactos creados en Plesk.</w:t>
-      </w:r>
-    </w:p>
-    <w:p>
-      <w:pPr>
-        <w:pStyle w:val="ListNumber"/>
-      </w:pPr>
-      <w:r>
-        <w:t>No retirar la regla ModPagespeed off del .htaccess.</w:t>
-      </w:r>
-    </w:p>
-    <w:p>
-      <w:pPr>
-        <w:pStyle w:val="Heading2"/>
-      </w:pPr>
-      <w:r>
-        <w:t>5. Instalación en cPanel</w:t>
-      </w:r>
-    </w:p>
-    <w:p>
-      <w:pPr>
-        <w:pStyle w:val="ListNumber"/>
-      </w:pPr>
-      <w:r>
-        <w:t>Crear base y usuario desde MySQL Databases.</w:t>
-      </w:r>
-    </w:p>
-    <w:p>
-      <w:pPr>
-        <w:pStyle w:val="ListNumber"/>
-      </w:pPr>
-      <w:r>
-        <w:t>Asignar todos los privilegios al usuario.</w:t>
-      </w:r>
-    </w:p>
-    <w:p>
-      <w:pPr>
-        <w:pStyle w:val="ListNumber"/>
-      </w:pPr>
-      <w:r>
-        <w:t>Subir SGCE por File Manager o FTP.</w:t>
-      </w:r>
-    </w:p>
-    <w:p>
-      <w:pPr>
-        <w:pStyle w:val="ListNumber"/>
-      </w:pPr>
-      <w:r>
-        <w:t>Ejecutar Instalar.php.</w:t>
-      </w:r>
-    </w:p>
-    <w:p>
-      <w:pPr>
-        <w:pStyle w:val="ListNumber"/>
-      </w:pPr>
-      <w:r>
-        <w:t>Usar el nombre completo de base y usuario como lo muestra cPanel.</w:t>
-      </w:r>
-    </w:p>
-    <w:p>
-      <w:pPr>
-        <w:pStyle w:val="Heading2"/>
-      </w:pPr>
-      <w:r>
-        <w:t>6. PageSpeed y cache</w:t>
-      </w:r>
-    </w:p>
-    <w:p>
-      <w:r>
-        <w:t>El .htaccess desactiva mod_pagespeed porque puede reescribir CSS/JS y romper colores, botones o modales. El sistema usa cache-busting sgce2026final para obligar al navegador a cargar assets actualizados.</w:t>
-      </w:r>
-    </w:p>
-    <w:p>
-      <w:pPr>
-        <w:pStyle w:val="Heading2"/>
-      </w:pPr>
-      <w:r>
-        <w:t>7. Seguridad</w:t>
-      </w:r>
-    </w:p>
-    <w:p>
-      <w:r>
-        <w:t>El sistema incluye CSRF, sesiones por token, cookies HttpOnly/SameSite, hash de contraseñas, rate limit en login, bloqueo de carpetas internas y restauración de respaldos firmados.</w:t>
-      </w:r>
-    </w:p>
-    <w:p>
-      <w:pPr>
-        <w:pStyle w:val="Heading2"/>
-      </w:pPr>
-      <w:r>
-        <w:t>8. Respaldo y restauración</w:t>
-      </w:r>
-    </w:p>
-    <w:p>
-      <w:r>
-        <w:t>Para restaurar desde el sistema usa Exportar solo datos. El importador rechaza SQL externo, estructura DROP/CREATE y respaldos sin firma SGCE.</w:t>
-      </w:r>
-    </w:p>
-    <w:p>
-      <w:pPr>
-        <w:pStyle w:val="Heading2"/>
-      </w:pPr>
-      <w:r>
-        <w:t>9. Revisión final</w:t>
-      </w:r>
-    </w:p>
-    <w:p>
-      <w:r>
-        <w:t>Antes de entregar al cliente: probar login, alta de maestro, grupo, alumno, asignación, asistencia, calificación, importación, exportación, respaldo y consulta pública.</w:t>
-      </w:r>
-    </w:p>
-    <w:p/>
     <w:tbl>
       <w:tblPr>
         <w:tblStyle w:val="TableGrid"/>
@@ -325,23 +135,37 @@
       <w:tr>
         <w:tc>
           <w:tcPr>
-            <w:tcW w:type="dxa" w:w="5112"/>
-            <w:shd w:fill="F2F4F7"/>
+            <w:tcW w:type="dxa" w:w="2448"/>
+            <w:shd w:fill="97051E"/>
+            <w:vAlign w:val="center"/>
           </w:tcPr>
           <w:p>
+            <w:r/>
             <w:r>
-              <w:t>Versión</w:t>
+              <w:rPr>
+                <w:b/>
+                <w:color w:val="FFFFFF"/>
+                <w:sz w:val="18"/>
+              </w:rPr>
+              <w:t>Componente</w:t>
             </w:r>
           </w:p>
         </w:tc>
         <w:tc>
           <w:tcPr>
-            <w:tcW w:type="dxa" w:w="5112"/>
-            <w:shd w:fill="F2F4F7"/>
+            <w:tcW w:type="dxa" w:w="6768"/>
+            <w:shd w:fill="97051E"/>
+            <w:vAlign w:val="center"/>
           </w:tcPr>
           <w:p>
+            <w:r/>
             <w:r>
-              <w:t>SGCE 2026 FINAL</w:t>
+              <w:rPr>
+                <w:b/>
+                <w:color w:val="FFFFFF"/>
+                <w:sz w:val="18"/>
+              </w:rPr>
+              <w:t>Requisito recomendado</w:t>
             </w:r>
           </w:p>
         </w:tc>
@@ -349,21 +173,35 @@
       <w:tr>
         <w:tc>
           <w:tcPr>
-            <w:tcW w:type="dxa" w:w="5112"/>
+            <w:tcW w:type="dxa" w:w="2448"/>
+            <w:vAlign w:val="center"/>
+            <w:shd w:fill="F8FAFC"/>
           </w:tcPr>
           <w:p>
+            <w:r/>
             <w:r>
-              <w:t>Calificación técnica estimada</w:t>
+              <w:rPr>
+                <w:b w:val="0"/>
+                <w:sz w:val="18"/>
+              </w:rPr>
+              <w:t>PHP</w:t>
             </w:r>
           </w:p>
         </w:tc>
         <w:tc>
           <w:tcPr>
-            <w:tcW w:type="dxa" w:w="5112"/>
+            <w:tcW w:type="dxa" w:w="6768"/>
+            <w:vAlign w:val="center"/>
+            <w:shd w:fill="F8FAFC"/>
           </w:tcPr>
           <w:p>
+            <w:r/>
             <w:r>
-              <w:t>9.4 / 10</w:t>
+              <w:rPr>
+                <w:b w:val="0"/>
+                <w:sz w:val="18"/>
+              </w:rPr>
+              <w:t>8.1 o superior</w:t>
             </w:r>
           </w:p>
         </w:tc>
@@ -371,26 +209,2609 @@
       <w:tr>
         <w:tc>
           <w:tcPr>
-            <w:tcW w:type="dxa" w:w="5112"/>
+            <w:tcW w:type="dxa" w:w="2448"/>
+            <w:vAlign w:val="center"/>
+            <w:shd w:fill="FFFFFF"/>
           </w:tcPr>
           <w:p>
+            <w:r/>
             <w:r>
-              <w:t>Compatibilidad</w:t>
+              <w:rPr>
+                <w:b w:val="0"/>
+                <w:sz w:val="18"/>
+              </w:rPr>
+              <w:t>Base de datos</w:t>
             </w:r>
           </w:p>
         </w:tc>
         <w:tc>
           <w:tcPr>
-            <w:tcW w:type="dxa" w:w="5112"/>
+            <w:tcW w:type="dxa" w:w="6768"/>
+            <w:vAlign w:val="center"/>
+            <w:shd w:fill="FFFFFF"/>
           </w:tcPr>
           <w:p>
+            <w:r/>
             <w:r>
-              <w:t>Local, Plesk, cPanel y hosting compartido</w:t>
+              <w:rPr>
+                <w:b w:val="0"/>
+                <w:sz w:val="18"/>
+              </w:rPr>
+              <w:t>MySQL 5.7+ o MariaDB 10.4+</w:t>
+            </w:r>
+          </w:p>
+        </w:tc>
+      </w:tr>
+      <w:tr>
+        <w:tc>
+          <w:tcPr>
+            <w:tcW w:type="dxa" w:w="2448"/>
+            <w:vAlign w:val="center"/>
+            <w:shd w:fill="F8FAFC"/>
+          </w:tcPr>
+          <w:p>
+            <w:r/>
+            <w:r>
+              <w:rPr>
+                <w:b w:val="0"/>
+                <w:sz w:val="18"/>
+              </w:rPr>
+              <w:t>Servidor web</w:t>
+            </w:r>
+          </w:p>
+        </w:tc>
+        <w:tc>
+          <w:tcPr>
+            <w:tcW w:type="dxa" w:w="6768"/>
+            <w:vAlign w:val="center"/>
+            <w:shd w:fill="F8FAFC"/>
+          </w:tcPr>
+          <w:p>
+            <w:r/>
+            <w:r>
+              <w:rPr>
+                <w:b w:val="0"/>
+                <w:sz w:val="18"/>
+              </w:rPr>
+              <w:t>Apache con .htaccess habilitado. En Plesk puede funcionar detrás de Nginx + Apache.</w:t>
+            </w:r>
+          </w:p>
+        </w:tc>
+      </w:tr>
+      <w:tr>
+        <w:tc>
+          <w:tcPr>
+            <w:tcW w:type="dxa" w:w="2448"/>
+            <w:vAlign w:val="center"/>
+            <w:shd w:fill="FFFFFF"/>
+          </w:tcPr>
+          <w:p>
+            <w:r/>
+            <w:r>
+              <w:rPr>
+                <w:b w:val="0"/>
+                <w:sz w:val="18"/>
+              </w:rPr>
+              <w:t>Extensiones PHP</w:t>
+            </w:r>
+          </w:p>
+        </w:tc>
+        <w:tc>
+          <w:tcPr>
+            <w:tcW w:type="dxa" w:w="6768"/>
+            <w:vAlign w:val="center"/>
+            <w:shd w:fill="FFFFFF"/>
+          </w:tcPr>
+          <w:p>
+            <w:r/>
+            <w:r>
+              <w:rPr>
+                <w:b w:val="0"/>
+                <w:sz w:val="18"/>
+              </w:rPr>
+              <w:t>pdo_mysql, zip, simplexml, mbstring, fileinfo, json y session</w:t>
+            </w:r>
+          </w:p>
+        </w:tc>
+      </w:tr>
+      <w:tr>
+        <w:tc>
+          <w:tcPr>
+            <w:tcW w:type="dxa" w:w="2448"/>
+            <w:vAlign w:val="center"/>
+            <w:shd w:fill="F8FAFC"/>
+          </w:tcPr>
+          <w:p>
+            <w:r/>
+            <w:r>
+              <w:rPr>
+                <w:b w:val="0"/>
+                <w:sz w:val="18"/>
+              </w:rPr>
+              <w:t>Permisos</w:t>
+            </w:r>
+          </w:p>
+        </w:tc>
+        <w:tc>
+          <w:tcPr>
+            <w:tcW w:type="dxa" w:w="6768"/>
+            <w:vAlign w:val="center"/>
+            <w:shd w:fill="F8FAFC"/>
+          </w:tcPr>
+          <w:p>
+            <w:r/>
+            <w:r>
+              <w:rPr>
+                <w:b w:val="0"/>
+                <w:sz w:val="18"/>
+              </w:rPr>
+              <w:t>Escritura durante instalación en config/ y escritura permanente en storage/</w:t>
+            </w:r>
+          </w:p>
+        </w:tc>
+      </w:tr>
+      <w:tr>
+        <w:tc>
+          <w:tcPr>
+            <w:tcW w:type="dxa" w:w="2448"/>
+            <w:vAlign w:val="center"/>
+            <w:shd w:fill="FFFFFF"/>
+          </w:tcPr>
+          <w:p>
+            <w:r/>
+            <w:r>
+              <w:rPr>
+                <w:b w:val="0"/>
+                <w:sz w:val="18"/>
+              </w:rPr>
+              <w:t>Subidas</w:t>
+            </w:r>
+          </w:p>
+        </w:tc>
+        <w:tc>
+          <w:tcPr>
+            <w:tcW w:type="dxa" w:w="6768"/>
+            <w:vAlign w:val="center"/>
+            <w:shd w:fill="FFFFFF"/>
+          </w:tcPr>
+          <w:p>
+            <w:r/>
+            <w:r>
+              <w:rPr>
+                <w:b w:val="0"/>
+                <w:sz w:val="18"/>
+              </w:rPr>
+              <w:t>file_uploads activo, upload_tmp_dir válido o carpeta temporal del sistema escribible</w:t>
             </w:r>
           </w:p>
         </w:tc>
       </w:tr>
     </w:tbl>
+    <w:p/>
+    <w:p>
+      <w:pPr>
+        <w:pStyle w:val="Heading1"/>
+      </w:pPr>
+      <w:r>
+        <w:rPr>
+          <w:b/>
+          <w:color w:val="97051E"/>
+        </w:rPr>
+        <w:t>3. Estructura de carpetas</w:t>
+      </w:r>
+    </w:p>
+    <w:tbl>
+      <w:tblPr>
+        <w:tblStyle w:val="TableGrid"/>
+        <w:tblW w:type="auto" w:w="0"/>
+        <w:jc w:val="center"/>
+        <w:tblLook w:firstColumn="1" w:firstRow="1" w:lastColumn="0" w:lastRow="0" w:noHBand="0" w:noVBand="1" w:val="04A0"/>
+      </w:tblPr>
+      <w:tblGrid>
+        <w:gridCol w:w="5112"/>
+        <w:gridCol w:w="5112"/>
+      </w:tblGrid>
+      <w:tr>
+        <w:tc>
+          <w:tcPr>
+            <w:tcW w:type="dxa" w:w="2592"/>
+            <w:shd w:fill="97051E"/>
+            <w:vAlign w:val="center"/>
+          </w:tcPr>
+          <w:p>
+            <w:r/>
+            <w:r>
+              <w:rPr>
+                <w:b/>
+                <w:color w:val="FFFFFF"/>
+                <w:sz w:val="18"/>
+              </w:rPr>
+              <w:t>Ruta</w:t>
+            </w:r>
+          </w:p>
+        </w:tc>
+        <w:tc>
+          <w:tcPr>
+            <w:tcW w:type="dxa" w:w="6624"/>
+            <w:shd w:fill="97051E"/>
+            <w:vAlign w:val="center"/>
+          </w:tcPr>
+          <w:p>
+            <w:r/>
+            <w:r>
+              <w:rPr>
+                <w:b/>
+                <w:color w:val="FFFFFF"/>
+                <w:sz w:val="18"/>
+              </w:rPr>
+              <w:t>Uso</w:t>
+            </w:r>
+          </w:p>
+        </w:tc>
+      </w:tr>
+      <w:tr>
+        <w:tc>
+          <w:tcPr>
+            <w:tcW w:type="dxa" w:w="2592"/>
+            <w:vAlign w:val="center"/>
+            <w:shd w:fill="F8FAFC"/>
+          </w:tcPr>
+          <w:p>
+            <w:r/>
+            <w:r>
+              <w:rPr>
+                <w:b w:val="0"/>
+                <w:sz w:val="18"/>
+              </w:rPr>
+              <w:t>assets/css, assets/js</w:t>
+            </w:r>
+          </w:p>
+        </w:tc>
+        <w:tc>
+          <w:tcPr>
+            <w:tcW w:type="dxa" w:w="6624"/>
+            <w:vAlign w:val="center"/>
+            <w:shd w:fill="F8FAFC"/>
+          </w:tcPr>
+          <w:p>
+            <w:r/>
+            <w:r>
+              <w:rPr>
+                <w:b w:val="0"/>
+                <w:sz w:val="18"/>
+              </w:rPr>
+              <w:t>Estilos y scripts del sistema. Los cache busting usan cache=sgce2026.</w:t>
+            </w:r>
+          </w:p>
+        </w:tc>
+      </w:tr>
+      <w:tr>
+        <w:tc>
+          <w:tcPr>
+            <w:tcW w:type="dxa" w:w="2592"/>
+            <w:vAlign w:val="center"/>
+            <w:shd w:fill="FFFFFF"/>
+          </w:tcPr>
+          <w:p>
+            <w:r/>
+            <w:r>
+              <w:rPr>
+                <w:b w:val="0"/>
+                <w:sz w:val="18"/>
+              </w:rPr>
+              <w:t>config/</w:t>
+            </w:r>
+          </w:p>
+        </w:tc>
+        <w:tc>
+          <w:tcPr>
+            <w:tcW w:type="dxa" w:w="6624"/>
+            <w:vAlign w:val="center"/>
+            <w:shd w:fill="FFFFFF"/>
+          </w:tcPr>
+          <w:p>
+            <w:r/>
+            <w:r>
+              <w:rPr>
+                <w:b w:val="0"/>
+                <w:sz w:val="18"/>
+              </w:rPr>
+              <w:t>Conexión a base de datos y configuración local. Protegido por .htaccess.</w:t>
+            </w:r>
+          </w:p>
+        </w:tc>
+      </w:tr>
+      <w:tr>
+        <w:tc>
+          <w:tcPr>
+            <w:tcW w:type="dxa" w:w="2592"/>
+            <w:vAlign w:val="center"/>
+            <w:shd w:fill="F8FAFC"/>
+          </w:tcPr>
+          <w:p>
+            <w:r/>
+            <w:r>
+              <w:rPr>
+                <w:b w:val="0"/>
+                <w:sz w:val="18"/>
+              </w:rPr>
+              <w:t>docs/</w:t>
+            </w:r>
+          </w:p>
+        </w:tc>
+        <w:tc>
+          <w:tcPr>
+            <w:tcW w:type="dxa" w:w="6624"/>
+            <w:vAlign w:val="center"/>
+            <w:shd w:fill="F8FAFC"/>
+          </w:tcPr>
+          <w:p>
+            <w:r/>
+            <w:r>
+              <w:rPr>
+                <w:b w:val="0"/>
+                <w:sz w:val="18"/>
+              </w:rPr>
+              <w:t>Manual técnico y manual de usuario en DOCX/PDF.</w:t>
+            </w:r>
+          </w:p>
+        </w:tc>
+      </w:tr>
+      <w:tr>
+        <w:tc>
+          <w:tcPr>
+            <w:tcW w:type="dxa" w:w="2592"/>
+            <w:vAlign w:val="center"/>
+            <w:shd w:fill="FFFFFF"/>
+          </w:tcPr>
+          <w:p>
+            <w:r/>
+            <w:r>
+              <w:rPr>
+                <w:b w:val="0"/>
+                <w:sz w:val="18"/>
+              </w:rPr>
+              <w:t>install/</w:t>
+            </w:r>
+          </w:p>
+        </w:tc>
+        <w:tc>
+          <w:tcPr>
+            <w:tcW w:type="dxa" w:w="6624"/>
+            <w:vAlign w:val="center"/>
+            <w:shd w:fill="FFFFFF"/>
+          </w:tcPr>
+          <w:p>
+            <w:r/>
+            <w:r>
+              <w:rPr>
+                <w:b w:val="0"/>
+                <w:sz w:val="18"/>
+              </w:rPr>
+              <w:t>Script SQL base para instalación desde cero.</w:t>
+            </w:r>
+          </w:p>
+        </w:tc>
+      </w:tr>
+      <w:tr>
+        <w:tc>
+          <w:tcPr>
+            <w:tcW w:type="dxa" w:w="2592"/>
+            <w:vAlign w:val="center"/>
+            <w:shd w:fill="F8FAFC"/>
+          </w:tcPr>
+          <w:p>
+            <w:r/>
+            <w:r>
+              <w:rPr>
+                <w:b w:val="0"/>
+                <w:sz w:val="18"/>
+              </w:rPr>
+              <w:t>includes/</w:t>
+            </w:r>
+          </w:p>
+        </w:tc>
+        <w:tc>
+          <w:tcPr>
+            <w:tcW w:type="dxa" w:w="6624"/>
+            <w:vAlign w:val="center"/>
+            <w:shd w:fill="F8FAFC"/>
+          </w:tcPr>
+          <w:p>
+            <w:r/>
+            <w:r>
+              <w:rPr>
+                <w:b w:val="0"/>
+                <w:sz w:val="18"/>
+              </w:rPr>
+              <w:t>Funciones comunes, seguridad, PDFs y consultas públicas.</w:t>
+            </w:r>
+          </w:p>
+        </w:tc>
+      </w:tr>
+      <w:tr>
+        <w:tc>
+          <w:tcPr>
+            <w:tcW w:type="dxa" w:w="2592"/>
+            <w:vAlign w:val="center"/>
+            <w:shd w:fill="FFFFFF"/>
+          </w:tcPr>
+          <w:p>
+            <w:r/>
+            <w:r>
+              <w:rPr>
+                <w:b w:val="0"/>
+                <w:sz w:val="18"/>
+              </w:rPr>
+              <w:t>modules/</w:t>
+            </w:r>
+          </w:p>
+        </w:tc>
+        <w:tc>
+          <w:tcPr>
+            <w:tcW w:type="dxa" w:w="6624"/>
+            <w:vAlign w:val="center"/>
+            <w:shd w:fill="FFFFFF"/>
+          </w:tcPr>
+          <w:p>
+            <w:r/>
+            <w:r>
+              <w:rPr>
+                <w:b w:val="0"/>
+                <w:sz w:val="18"/>
+              </w:rPr>
+              <w:t>Módulos internos por rol y vistas administrativas.</w:t>
+            </w:r>
+          </w:p>
+        </w:tc>
+      </w:tr>
+      <w:tr>
+        <w:tc>
+          <w:tcPr>
+            <w:tcW w:type="dxa" w:w="2592"/>
+            <w:vAlign w:val="center"/>
+            <w:shd w:fill="F8FAFC"/>
+          </w:tcPr>
+          <w:p>
+            <w:r/>
+            <w:r>
+              <w:rPr>
+                <w:b w:val="0"/>
+                <w:sz w:val="18"/>
+              </w:rPr>
+              <w:t>public/</w:t>
+            </w:r>
+          </w:p>
+        </w:tc>
+        <w:tc>
+          <w:tcPr>
+            <w:tcW w:type="dxa" w:w="6624"/>
+            <w:vAlign w:val="center"/>
+            <w:shd w:fill="F8FAFC"/>
+          </w:tcPr>
+          <w:p>
+            <w:r/>
+            <w:r>
+              <w:rPr>
+                <w:b w:val="0"/>
+                <w:sz w:val="18"/>
+              </w:rPr>
+              <w:t>Login y consultas públicas para padres/alumnos.</w:t>
+            </w:r>
+          </w:p>
+        </w:tc>
+      </w:tr>
+      <w:tr>
+        <w:tc>
+          <w:tcPr>
+            <w:tcW w:type="dxa" w:w="2592"/>
+            <w:vAlign w:val="center"/>
+            <w:shd w:fill="FFFFFF"/>
+          </w:tcPr>
+          <w:p>
+            <w:r/>
+            <w:r>
+              <w:rPr>
+                <w:b w:val="0"/>
+                <w:sz w:val="18"/>
+              </w:rPr>
+              <w:t>reports/</w:t>
+            </w:r>
+          </w:p>
+        </w:tc>
+        <w:tc>
+          <w:tcPr>
+            <w:tcW w:type="dxa" w:w="6624"/>
+            <w:vAlign w:val="center"/>
+            <w:shd w:fill="FFFFFF"/>
+          </w:tcPr>
+          <w:p>
+            <w:r/>
+            <w:r>
+              <w:rPr>
+                <w:b w:val="0"/>
+                <w:sz w:val="18"/>
+              </w:rPr>
+              <w:t>Exportaciones PDF/Excel y respaldos.</w:t>
+            </w:r>
+          </w:p>
+        </w:tc>
+      </w:tr>
+      <w:tr>
+        <w:tc>
+          <w:tcPr>
+            <w:tcW w:type="dxa" w:w="2592"/>
+            <w:vAlign w:val="center"/>
+            <w:shd w:fill="F8FAFC"/>
+          </w:tcPr>
+          <w:p>
+            <w:r/>
+            <w:r>
+              <w:rPr>
+                <w:b w:val="0"/>
+                <w:sz w:val="18"/>
+              </w:rPr>
+              <w:t>services/</w:t>
+            </w:r>
+          </w:p>
+        </w:tc>
+        <w:tc>
+          <w:tcPr>
+            <w:tcW w:type="dxa" w:w="6624"/>
+            <w:vAlign w:val="center"/>
+            <w:shd w:fill="F8FAFC"/>
+          </w:tcPr>
+          <w:p>
+            <w:r/>
+            <w:r>
+              <w:rPr>
+                <w:b w:val="0"/>
+                <w:sz w:val="18"/>
+              </w:rPr>
+              <w:t>Servicios de datos por entidad escolar.</w:t>
+            </w:r>
+          </w:p>
+        </w:tc>
+      </w:tr>
+      <w:tr>
+        <w:tc>
+          <w:tcPr>
+            <w:tcW w:type="dxa" w:w="2592"/>
+            <w:vAlign w:val="center"/>
+            <w:shd w:fill="FFFFFF"/>
+          </w:tcPr>
+          <w:p>
+            <w:r/>
+            <w:r>
+              <w:rPr>
+                <w:b w:val="0"/>
+                <w:sz w:val="18"/>
+              </w:rPr>
+              <w:t>storage/</w:t>
+            </w:r>
+          </w:p>
+        </w:tc>
+        <w:tc>
+          <w:tcPr>
+            <w:tcW w:type="dxa" w:w="6624"/>
+            <w:vAlign w:val="center"/>
+            <w:shd w:fill="FFFFFF"/>
+          </w:tcPr>
+          <w:p>
+            <w:r/>
+            <w:r>
+              <w:rPr>
+                <w:b w:val="0"/>
+                <w:sz w:val="18"/>
+              </w:rPr>
+              <w:t>Backups, logs, locks, planeaciones y subidas temporales.</w:t>
+            </w:r>
+          </w:p>
+        </w:tc>
+      </w:tr>
+      <w:tr>
+        <w:tc>
+          <w:tcPr>
+            <w:tcW w:type="dxa" w:w="2592"/>
+            <w:vAlign w:val="center"/>
+            <w:shd w:fill="F8FAFC"/>
+          </w:tcPr>
+          <w:p>
+            <w:r/>
+            <w:r>
+              <w:rPr>
+                <w:b w:val="0"/>
+                <w:sz w:val="18"/>
+              </w:rPr>
+              <w:t>tests/</w:t>
+            </w:r>
+          </w:p>
+        </w:tc>
+        <w:tc>
+          <w:tcPr>
+            <w:tcW w:type="dxa" w:w="6624"/>
+            <w:vAlign w:val="center"/>
+            <w:shd w:fill="F8FAFC"/>
+          </w:tcPr>
+          <w:p>
+            <w:r/>
+            <w:r>
+              <w:rPr>
+                <w:b w:val="0"/>
+                <w:sz w:val="18"/>
+              </w:rPr>
+              <w:t>Pruebas estáticas y pruebas de módulos críticos por CLI.</w:t>
+            </w:r>
+          </w:p>
+        </w:tc>
+      </w:tr>
+    </w:tbl>
+    <w:p/>
+    <w:p>
+      <w:pPr>
+        <w:pStyle w:val="Heading1"/>
+      </w:pPr>
+      <w:r>
+        <w:rPr>
+          <w:b/>
+          <w:color w:val="97051E"/>
+        </w:rPr>
+        <w:t>4. Instalación desde cero</w:t>
+      </w:r>
+    </w:p>
+    <w:p>
+      <w:pPr>
+        <w:ind w:left="360" w:hanging="360"/>
+      </w:pPr>
+      <w:r>
+        <w:rPr>
+          <w:b/>
+          <w:sz w:val="20"/>
+        </w:rPr>
+        <w:t xml:space="preserve">1. </w:t>
+      </w:r>
+      <w:r>
+        <w:rPr>
+          <w:sz w:val="20"/>
+        </w:rPr>
+        <w:t>Subir la carpeta SGCE completa al dominio, subdominio o directorio local.</w:t>
+      </w:r>
+    </w:p>
+    <w:p>
+      <w:pPr>
+        <w:ind w:left="360" w:hanging="360"/>
+      </w:pPr>
+      <w:r>
+        <w:rPr>
+          <w:b/>
+          <w:sz w:val="20"/>
+        </w:rPr>
+        <w:t xml:space="preserve">2. </w:t>
+      </w:r>
+      <w:r>
+        <w:rPr>
+          <w:sz w:val="20"/>
+        </w:rPr>
+        <w:t>Crear una base de datos vacía y un usuario con permisos completos sobre esa base.</w:t>
+      </w:r>
+    </w:p>
+    <w:p>
+      <w:pPr>
+        <w:ind w:left="360" w:hanging="360"/>
+      </w:pPr>
+      <w:r>
+        <w:rPr>
+          <w:b/>
+          <w:sz w:val="20"/>
+        </w:rPr>
+        <w:t xml:space="preserve">3. </w:t>
+      </w:r>
+      <w:r>
+        <w:rPr>
+          <w:sz w:val="20"/>
+        </w:rPr>
+        <w:t>Verificar que config/ y storage/ tengan permisos de escritura para el usuario de PHP.</w:t>
+      </w:r>
+    </w:p>
+    <w:p>
+      <w:pPr>
+        <w:ind w:left="360" w:hanging="360"/>
+      </w:pPr>
+      <w:r>
+        <w:rPr>
+          <w:b/>
+          <w:sz w:val="20"/>
+        </w:rPr>
+        <w:t xml:space="preserve">4. </w:t>
+      </w:r>
+      <w:r>
+        <w:rPr>
+          <w:sz w:val="20"/>
+        </w:rPr>
+        <w:t>Abrir Instalar.php desde el navegador.</w:t>
+      </w:r>
+    </w:p>
+    <w:p>
+      <w:pPr>
+        <w:ind w:left="360" w:hanging="360"/>
+      </w:pPr>
+      <w:r>
+        <w:rPr>
+          <w:b/>
+          <w:sz w:val="20"/>
+        </w:rPr>
+        <w:t xml:space="preserve">5. </w:t>
+      </w:r>
+      <w:r>
+        <w:rPr>
+          <w:sz w:val="20"/>
+        </w:rPr>
+        <w:t>Pulsar Verificar servidor y corregir advertencias críticas antes de continuar.</w:t>
+      </w:r>
+    </w:p>
+    <w:p>
+      <w:pPr>
+        <w:ind w:left="360" w:hanging="360"/>
+      </w:pPr>
+      <w:r>
+        <w:rPr>
+          <w:b/>
+          <w:sz w:val="20"/>
+        </w:rPr>
+        <w:t xml:space="preserve">6. </w:t>
+      </w:r>
+      <w:r>
+        <w:rPr>
+          <w:sz w:val="20"/>
+        </w:rPr>
+        <w:t>Capturar datos de conexión, datos de escuela, ciclo escolar inicial y administrador.</w:t>
+      </w:r>
+    </w:p>
+    <w:p>
+      <w:pPr>
+        <w:ind w:left="360" w:hanging="360"/>
+      </w:pPr>
+      <w:r>
+        <w:rPr>
+          <w:b/>
+          <w:sz w:val="20"/>
+        </w:rPr>
+        <w:t xml:space="preserve">7. </w:t>
+      </w:r>
+      <w:r>
+        <w:rPr>
+          <w:sz w:val="20"/>
+        </w:rPr>
+        <w:t>Escribir la confirmación INSTALAR SGCE y ejecutar la instalación.</w:t>
+      </w:r>
+    </w:p>
+    <w:p>
+      <w:pPr>
+        <w:ind w:left="360" w:hanging="360"/>
+      </w:pPr>
+      <w:r>
+        <w:rPr>
+          <w:b/>
+          <w:sz w:val="20"/>
+        </w:rPr>
+        <w:t xml:space="preserve">8. </w:t>
+      </w:r>
+      <w:r>
+        <w:rPr>
+          <w:sz w:val="20"/>
+        </w:rPr>
+        <w:t>Entrar desde index.php y validar el login administrador.</w:t>
+      </w:r>
+    </w:p>
+    <w:tbl>
+      <w:tblPr>
+        <w:tblW w:type="auto" w:w="0"/>
+        <w:jc w:val="center"/>
+        <w:tblLayout w:type="autofit"/>
+        <w:tblLook w:firstColumn="1" w:firstRow="1" w:lastColumn="0" w:lastRow="0" w:noHBand="0" w:noVBand="1" w:val="04A0"/>
+      </w:tblPr>
+      <w:tblGrid>
+        <w:gridCol w:w="10224"/>
+      </w:tblGrid>
+      <w:tr>
+        <w:tc>
+          <w:tcPr>
+            <w:tcW w:type="dxa" w:w="10224"/>
+            <w:shd w:fill="FFF7ED"/>
+          </w:tcPr>
+          <w:p>
+            <w:r>
+              <w:rPr>
+                <w:b/>
+                <w:color w:val="1F2937"/>
+                <w:sz w:val="20"/>
+              </w:rPr>
+              <w:t>Importante</w:t>
+            </w:r>
+          </w:p>
+          <w:p>
+            <w:r>
+              <w:rPr>
+                <w:color w:val="667085"/>
+                <w:sz w:val="18"/>
+              </w:rPr>
+              <w:t>Después de instalar, el acceso normal debe ser index.php. No se recomienda reutilizar bases viejas para una prueba limpia; usa una base vacía.</w:t>
+            </w:r>
+          </w:p>
+        </w:tc>
+      </w:tr>
+    </w:tbl>
+    <w:p/>
+    <w:p>
+      <w:pPr>
+        <w:pStyle w:val="Heading1"/>
+      </w:pPr>
+      <w:r>
+        <w:rPr>
+          <w:b/>
+          <w:color w:val="97051E"/>
+        </w:rPr>
+        <w:t>5. Instalación en Plesk</w:t>
+      </w:r>
+    </w:p>
+    <w:p>
+      <w:pPr>
+        <w:pStyle w:val="ListBullet"/>
+      </w:pPr>
+      <w:r>
+        <w:t>Crear base de datos desde Plesk y copiar exactamente el nombre, usuario, contraseña y host.</w:t>
+      </w:r>
+    </w:p>
+    <w:p>
+      <w:pPr>
+        <w:pStyle w:val="ListBullet"/>
+      </w:pPr>
+      <w:r>
+        <w:t>Subir SGCE por Administrador de archivos o FTP/SFTP.</w:t>
+      </w:r>
+    </w:p>
+    <w:p>
+      <w:pPr>
+        <w:pStyle w:val="ListBullet"/>
+      </w:pPr>
+      <w:r>
+        <w:t>En Configuración de PHP revisar que file_uploads esté activo y que upload_tmp_dir no apunte a una ruta inválida.</w:t>
+      </w:r>
+    </w:p>
+    <w:p>
+      <w:pPr>
+        <w:pStyle w:val="ListBullet"/>
+      </w:pPr>
+      <w:r>
+        <w:t>No desactivar las reglas de .htaccess que bloquean SQL, ZIP, README, MD, DM y archivos sensibles.</w:t>
+      </w:r>
+    </w:p>
+    <w:p>
+      <w:pPr>
+        <w:pStyle w:val="ListBullet"/>
+      </w:pPr>
+      <w:r>
+        <w:t>Si existe PageSpeed, mantener ModPagespeed off para evitar reescrituras de CSS/JS.</w:t>
+      </w:r>
+    </w:p>
+    <w:p>
+      <w:pPr>
+        <w:pStyle w:val="ListBullet"/>
+      </w:pPr>
+      <w:r>
+        <w:t>Para respaldos automáticos, crear tareas programadas apuntando a cron/backup_diario.php y cron/backup_semanal.php.</w:t>
+      </w:r>
+    </w:p>
+    <w:p>
+      <w:pPr>
+        <w:pStyle w:val="Heading1"/>
+      </w:pPr>
+      <w:r>
+        <w:rPr>
+          <w:b/>
+          <w:color w:val="97051E"/>
+        </w:rPr>
+        <w:t>6. Permisos recomendados</w:t>
+      </w:r>
+    </w:p>
+    <w:tbl>
+      <w:tblPr>
+        <w:tblStyle w:val="TableGrid"/>
+        <w:tblW w:type="auto" w:w="0"/>
+        <w:jc w:val="center"/>
+        <w:tblLook w:firstColumn="1" w:firstRow="1" w:lastColumn="0" w:lastRow="0" w:noHBand="0" w:noVBand="1" w:val="04A0"/>
+      </w:tblPr>
+      <w:tblGrid>
+        <w:gridCol w:w="3408"/>
+        <w:gridCol w:w="3408"/>
+        <w:gridCol w:w="3408"/>
+      </w:tblGrid>
+      <w:tr>
+        <w:tc>
+          <w:tcPr>
+            <w:tcW w:type="dxa" w:w="2592"/>
+            <w:shd w:fill="97051E"/>
+            <w:vAlign w:val="center"/>
+          </w:tcPr>
+          <w:p>
+            <w:r/>
+            <w:r>
+              <w:rPr>
+                <w:b/>
+                <w:color w:val="FFFFFF"/>
+                <w:sz w:val="18"/>
+              </w:rPr>
+              <w:t>Elemento</w:t>
+            </w:r>
+          </w:p>
+        </w:tc>
+        <w:tc>
+          <w:tcPr>
+            <w:tcW w:type="dxa" w:w="2304"/>
+            <w:shd w:fill="97051E"/>
+            <w:vAlign w:val="center"/>
+          </w:tcPr>
+          <w:p>
+            <w:r/>
+            <w:r>
+              <w:rPr>
+                <w:b/>
+                <w:color w:val="FFFFFF"/>
+                <w:sz w:val="18"/>
+              </w:rPr>
+              <w:t>Permiso sugerido</w:t>
+            </w:r>
+          </w:p>
+        </w:tc>
+        <w:tc>
+          <w:tcPr>
+            <w:tcW w:type="dxa" w:w="4320"/>
+            <w:shd w:fill="97051E"/>
+            <w:vAlign w:val="center"/>
+          </w:tcPr>
+          <w:p>
+            <w:r/>
+            <w:r>
+              <w:rPr>
+                <w:b/>
+                <w:color w:val="FFFFFF"/>
+                <w:sz w:val="18"/>
+              </w:rPr>
+              <w:t>Comentario</w:t>
+            </w:r>
+          </w:p>
+        </w:tc>
+      </w:tr>
+      <w:tr>
+        <w:tc>
+          <w:tcPr>
+            <w:tcW w:type="dxa" w:w="2592"/>
+            <w:vAlign w:val="center"/>
+            <w:shd w:fill="F8FAFC"/>
+          </w:tcPr>
+          <w:p>
+            <w:r/>
+            <w:r>
+              <w:rPr>
+                <w:b w:val="0"/>
+                <w:sz w:val="18"/>
+              </w:rPr>
+              <w:t>Archivos PHP/CSS/JS</w:t>
+            </w:r>
+          </w:p>
+        </w:tc>
+        <w:tc>
+          <w:tcPr>
+            <w:tcW w:type="dxa" w:w="2304"/>
+            <w:vAlign w:val="center"/>
+            <w:shd w:fill="F8FAFC"/>
+          </w:tcPr>
+          <w:p>
+            <w:r/>
+            <w:r>
+              <w:rPr>
+                <w:b w:val="0"/>
+                <w:sz w:val="18"/>
+              </w:rPr>
+              <w:t>644</w:t>
+            </w:r>
+          </w:p>
+        </w:tc>
+        <w:tc>
+          <w:tcPr>
+            <w:tcW w:type="dxa" w:w="4320"/>
+            <w:vAlign w:val="center"/>
+            <w:shd w:fill="F8FAFC"/>
+          </w:tcPr>
+          <w:p>
+            <w:r/>
+            <w:r>
+              <w:rPr>
+                <w:b w:val="0"/>
+                <w:sz w:val="18"/>
+              </w:rPr>
+              <w:t>Lectura normal para el servidor web.</w:t>
+            </w:r>
+          </w:p>
+        </w:tc>
+      </w:tr>
+      <w:tr>
+        <w:tc>
+          <w:tcPr>
+            <w:tcW w:type="dxa" w:w="2592"/>
+            <w:vAlign w:val="center"/>
+            <w:shd w:fill="FFFFFF"/>
+          </w:tcPr>
+          <w:p>
+            <w:r/>
+            <w:r>
+              <w:rPr>
+                <w:b w:val="0"/>
+                <w:sz w:val="18"/>
+              </w:rPr>
+              <w:t>Carpetas generales</w:t>
+            </w:r>
+          </w:p>
+        </w:tc>
+        <w:tc>
+          <w:tcPr>
+            <w:tcW w:type="dxa" w:w="2304"/>
+            <w:vAlign w:val="center"/>
+            <w:shd w:fill="FFFFFF"/>
+          </w:tcPr>
+          <w:p>
+            <w:r/>
+            <w:r>
+              <w:rPr>
+                <w:b w:val="0"/>
+                <w:sz w:val="18"/>
+              </w:rPr>
+              <w:t>755</w:t>
+            </w:r>
+          </w:p>
+        </w:tc>
+        <w:tc>
+          <w:tcPr>
+            <w:tcW w:type="dxa" w:w="4320"/>
+            <w:vAlign w:val="center"/>
+            <w:shd w:fill="FFFFFF"/>
+          </w:tcPr>
+          <w:p>
+            <w:r/>
+            <w:r>
+              <w:rPr>
+                <w:b w:val="0"/>
+                <w:sz w:val="18"/>
+              </w:rPr>
+              <w:t>Navegación de Apache sin permitir escritura innecesaria.</w:t>
+            </w:r>
+          </w:p>
+        </w:tc>
+      </w:tr>
+      <w:tr>
+        <w:tc>
+          <w:tcPr>
+            <w:tcW w:type="dxa" w:w="2592"/>
+            <w:vAlign w:val="center"/>
+            <w:shd w:fill="F8FAFC"/>
+          </w:tcPr>
+          <w:p>
+            <w:r/>
+            <w:r>
+              <w:rPr>
+                <w:b w:val="0"/>
+                <w:sz w:val="18"/>
+              </w:rPr>
+              <w:t>config/</w:t>
+            </w:r>
+          </w:p>
+        </w:tc>
+        <w:tc>
+          <w:tcPr>
+            <w:tcW w:type="dxa" w:w="2304"/>
+            <w:vAlign w:val="center"/>
+            <w:shd w:fill="F8FAFC"/>
+          </w:tcPr>
+          <w:p>
+            <w:r/>
+            <w:r>
+              <w:rPr>
+                <w:b w:val="0"/>
+                <w:sz w:val="18"/>
+              </w:rPr>
+              <w:t>775 durante instalación; después puede quedar 755 si database.php ya existe</w:t>
+            </w:r>
+          </w:p>
+        </w:tc>
+        <w:tc>
+          <w:tcPr>
+            <w:tcW w:type="dxa" w:w="4320"/>
+            <w:vAlign w:val="center"/>
+            <w:shd w:fill="F8FAFC"/>
+          </w:tcPr>
+          <w:p>
+            <w:r/>
+            <w:r>
+              <w:rPr>
+                <w:b w:val="0"/>
+                <w:sz w:val="18"/>
+              </w:rPr>
+              <w:t>Debe poder escribirse al instalar.</w:t>
+            </w:r>
+          </w:p>
+        </w:tc>
+      </w:tr>
+      <w:tr>
+        <w:tc>
+          <w:tcPr>
+            <w:tcW w:type="dxa" w:w="2592"/>
+            <w:vAlign w:val="center"/>
+            <w:shd w:fill="FFFFFF"/>
+          </w:tcPr>
+          <w:p>
+            <w:r/>
+            <w:r>
+              <w:rPr>
+                <w:b w:val="0"/>
+                <w:sz w:val="18"/>
+              </w:rPr>
+              <w:t>storage/</w:t>
+            </w:r>
+          </w:p>
+        </w:tc>
+        <w:tc>
+          <w:tcPr>
+            <w:tcW w:type="dxa" w:w="2304"/>
+            <w:vAlign w:val="center"/>
+            <w:shd w:fill="FFFFFF"/>
+          </w:tcPr>
+          <w:p>
+            <w:r/>
+            <w:r>
+              <w:rPr>
+                <w:b w:val="0"/>
+                <w:sz w:val="18"/>
+              </w:rPr>
+              <w:t>775</w:t>
+            </w:r>
+          </w:p>
+        </w:tc>
+        <w:tc>
+          <w:tcPr>
+            <w:tcW w:type="dxa" w:w="4320"/>
+            <w:vAlign w:val="center"/>
+            <w:shd w:fill="FFFFFF"/>
+          </w:tcPr>
+          <w:p>
+            <w:r/>
+            <w:r>
+              <w:rPr>
+                <w:b w:val="0"/>
+                <w:sz w:val="18"/>
+              </w:rPr>
+              <w:t>Necesario para backups, logs, locks, planeaciones y subidas temporales.</w:t>
+            </w:r>
+          </w:p>
+        </w:tc>
+      </w:tr>
+      <w:tr>
+        <w:tc>
+          <w:tcPr>
+            <w:tcW w:type="dxa" w:w="2592"/>
+            <w:vAlign w:val="center"/>
+            <w:shd w:fill="F8FAFC"/>
+          </w:tcPr>
+          <w:p>
+            <w:r/>
+            <w:r>
+              <w:rPr>
+                <w:b w:val="0"/>
+                <w:sz w:val="18"/>
+              </w:rPr>
+              <w:t>storage/tmp_uploads</w:t>
+            </w:r>
+          </w:p>
+        </w:tc>
+        <w:tc>
+          <w:tcPr>
+            <w:tcW w:type="dxa" w:w="2304"/>
+            <w:vAlign w:val="center"/>
+            <w:shd w:fill="F8FAFC"/>
+          </w:tcPr>
+          <w:p>
+            <w:r/>
+            <w:r>
+              <w:rPr>
+                <w:b w:val="0"/>
+                <w:sz w:val="18"/>
+              </w:rPr>
+              <w:t>775</w:t>
+            </w:r>
+          </w:p>
+        </w:tc>
+        <w:tc>
+          <w:tcPr>
+            <w:tcW w:type="dxa" w:w="4320"/>
+            <w:vAlign w:val="center"/>
+            <w:shd w:fill="F8FAFC"/>
+          </w:tcPr>
+          <w:p>
+            <w:r/>
+            <w:r>
+              <w:rPr>
+                <w:b w:val="0"/>
+                <w:sz w:val="18"/>
+              </w:rPr>
+              <w:t>Usado por el sistema cuando procesa archivos subidos.</w:t>
+            </w:r>
+          </w:p>
+        </w:tc>
+      </w:tr>
+    </w:tbl>
+    <w:p/>
+    <w:p>
+      <w:pPr>
+        <w:pStyle w:val="Heading1"/>
+      </w:pPr>
+      <w:r>
+        <w:rPr>
+          <w:b/>
+          <w:color w:val="97051E"/>
+        </w:rPr>
+        <w:t>7. Roles y permisos</w:t>
+      </w:r>
+    </w:p>
+    <w:tbl>
+      <w:tblPr>
+        <w:tblStyle w:val="TableGrid"/>
+        <w:tblW w:type="auto" w:w="0"/>
+        <w:jc w:val="center"/>
+        <w:tblLook w:firstColumn="1" w:firstRow="1" w:lastColumn="0" w:lastRow="0" w:noHBand="0" w:noVBand="1" w:val="04A0"/>
+      </w:tblPr>
+      <w:tblGrid>
+        <w:gridCol w:w="5112"/>
+        <w:gridCol w:w="5112"/>
+      </w:tblGrid>
+      <w:tr>
+        <w:tc>
+          <w:tcPr>
+            <w:tcW w:type="dxa" w:w="2160"/>
+            <w:shd w:fill="97051E"/>
+            <w:vAlign w:val="center"/>
+          </w:tcPr>
+          <w:p>
+            <w:r/>
+            <w:r>
+              <w:rPr>
+                <w:b/>
+                <w:color w:val="FFFFFF"/>
+                <w:sz w:val="18"/>
+              </w:rPr>
+              <w:t>Rol</w:t>
+            </w:r>
+          </w:p>
+        </w:tc>
+        <w:tc>
+          <w:tcPr>
+            <w:tcW w:type="dxa" w:w="7056"/>
+            <w:shd w:fill="97051E"/>
+            <w:vAlign w:val="center"/>
+          </w:tcPr>
+          <w:p>
+            <w:r/>
+            <w:r>
+              <w:rPr>
+                <w:b/>
+                <w:color w:val="FFFFFF"/>
+                <w:sz w:val="18"/>
+              </w:rPr>
+              <w:t>Funciones principales</w:t>
+            </w:r>
+          </w:p>
+        </w:tc>
+      </w:tr>
+      <w:tr>
+        <w:tc>
+          <w:tcPr>
+            <w:tcW w:type="dxa" w:w="2160"/>
+            <w:vAlign w:val="center"/>
+            <w:shd w:fill="F8FAFC"/>
+          </w:tcPr>
+          <w:p>
+            <w:r/>
+            <w:r>
+              <w:rPr>
+                <w:b w:val="0"/>
+                <w:sz w:val="18"/>
+              </w:rPr>
+              <w:t>admin</w:t>
+            </w:r>
+          </w:p>
+        </w:tc>
+        <w:tc>
+          <w:tcPr>
+            <w:tcW w:type="dxa" w:w="7056"/>
+            <w:vAlign w:val="center"/>
+            <w:shd w:fill="F8FAFC"/>
+          </w:tcPr>
+          <w:p>
+            <w:r/>
+            <w:r>
+              <w:rPr>
+                <w:b w:val="0"/>
+                <w:sz w:val="18"/>
+              </w:rPr>
+              <w:t>Configuración general, usuarios, maestros, grupos, alumnos, asignaciones, reportes, respaldos, restauración y bitácora.</w:t>
+            </w:r>
+          </w:p>
+        </w:tc>
+      </w:tr>
+      <w:tr>
+        <w:tc>
+          <w:tcPr>
+            <w:tcW w:type="dxa" w:w="2160"/>
+            <w:vAlign w:val="center"/>
+            <w:shd w:fill="FFFFFF"/>
+          </w:tcPr>
+          <w:p>
+            <w:r/>
+            <w:r>
+              <w:rPr>
+                <w:b w:val="0"/>
+                <w:sz w:val="18"/>
+              </w:rPr>
+              <w:t>maestro</w:t>
+            </w:r>
+          </w:p>
+        </w:tc>
+        <w:tc>
+          <w:tcPr>
+            <w:tcW w:type="dxa" w:w="7056"/>
+            <w:vAlign w:val="center"/>
+            <w:shd w:fill="FFFFFF"/>
+          </w:tcPr>
+          <w:p>
+            <w:r/>
+            <w:r>
+              <w:rPr>
+                <w:b w:val="0"/>
+                <w:sz w:val="18"/>
+              </w:rPr>
+              <w:t>Ver asignaciones propias, pasar lista, capturar calificaciones, subir planeaciones y exportar reportes propios.</w:t>
+            </w:r>
+          </w:p>
+        </w:tc>
+      </w:tr>
+      <w:tr>
+        <w:tc>
+          <w:tcPr>
+            <w:tcW w:type="dxa" w:w="2160"/>
+            <w:vAlign w:val="center"/>
+            <w:shd w:fill="F8FAFC"/>
+          </w:tcPr>
+          <w:p>
+            <w:r/>
+            <w:r>
+              <w:rPr>
+                <w:b w:val="0"/>
+                <w:sz w:val="18"/>
+              </w:rPr>
+              <w:t>administrativo</w:t>
+            </w:r>
+          </w:p>
+        </w:tc>
+        <w:tc>
+          <w:tcPr>
+            <w:tcW w:type="dxa" w:w="7056"/>
+            <w:vAlign w:val="center"/>
+            <w:shd w:fill="F8FAFC"/>
+          </w:tcPr>
+          <w:p>
+            <w:r/>
+            <w:r>
+              <w:rPr>
+                <w:b w:val="0"/>
+                <w:sz w:val="18"/>
+              </w:rPr>
+              <w:t>Gestión operativa de catálogos, avisos, reportes, asistencia, calificaciones, importaciones y planeaciones sin acceso a configuración, usuarios, respaldos ni bitácora.</w:t>
+            </w:r>
+          </w:p>
+        </w:tc>
+      </w:tr>
+      <w:tr>
+        <w:tc>
+          <w:tcPr>
+            <w:tcW w:type="dxa" w:w="2160"/>
+            <w:vAlign w:val="center"/>
+            <w:shd w:fill="FFFFFF"/>
+          </w:tcPr>
+          <w:p>
+            <w:r/>
+            <w:r>
+              <w:rPr>
+                <w:b w:val="0"/>
+                <w:sz w:val="18"/>
+              </w:rPr>
+              <w:t>público</w:t>
+            </w:r>
+          </w:p>
+        </w:tc>
+        <w:tc>
+          <w:tcPr>
+            <w:tcW w:type="dxa" w:w="7056"/>
+            <w:vAlign w:val="center"/>
+            <w:shd w:fill="FFFFFF"/>
+          </w:tcPr>
+          <w:p>
+            <w:r/>
+            <w:r>
+              <w:rPr>
+                <w:b w:val="0"/>
+                <w:sz w:val="18"/>
+              </w:rPr>
+              <w:t>Consulta individual de asistencia y calificaciones mediante datos del alumno, sin mostrar listas completas.</w:t>
+            </w:r>
+          </w:p>
+        </w:tc>
+      </w:tr>
+    </w:tbl>
+    <w:p/>
+    <w:p>
+      <w:pPr>
+        <w:pStyle w:val="Heading1"/>
+      </w:pPr>
+      <w:r>
+        <w:rPr>
+          <w:b/>
+          <w:color w:val="97051E"/>
+        </w:rPr>
+        <w:t>8. Base de datos</w:t>
+      </w:r>
+    </w:p>
+    <w:tbl>
+      <w:tblPr>
+        <w:tblStyle w:val="TableGrid"/>
+        <w:tblW w:type="auto" w:w="0"/>
+        <w:jc w:val="center"/>
+        <w:tblLook w:firstColumn="1" w:firstRow="1" w:lastColumn="0" w:lastRow="0" w:noHBand="0" w:noVBand="1" w:val="04A0"/>
+      </w:tblPr>
+      <w:tblGrid>
+        <w:gridCol w:w="5112"/>
+        <w:gridCol w:w="5112"/>
+      </w:tblGrid>
+      <w:tr>
+        <w:tc>
+          <w:tcPr>
+            <w:tcW w:type="dxa" w:w="3024"/>
+            <w:shd w:fill="97051E"/>
+            <w:vAlign w:val="center"/>
+          </w:tcPr>
+          <w:p>
+            <w:r/>
+            <w:r>
+              <w:rPr>
+                <w:b/>
+                <w:color w:val="FFFFFF"/>
+                <w:sz w:val="18"/>
+              </w:rPr>
+              <w:t>Tabla</w:t>
+            </w:r>
+          </w:p>
+        </w:tc>
+        <w:tc>
+          <w:tcPr>
+            <w:tcW w:type="dxa" w:w="6192"/>
+            <w:shd w:fill="97051E"/>
+            <w:vAlign w:val="center"/>
+          </w:tcPr>
+          <w:p>
+            <w:r/>
+            <w:r>
+              <w:rPr>
+                <w:b/>
+                <w:color w:val="FFFFFF"/>
+                <w:sz w:val="18"/>
+              </w:rPr>
+              <w:t>Propósito</w:t>
+            </w:r>
+          </w:p>
+        </w:tc>
+      </w:tr>
+      <w:tr>
+        <w:tc>
+          <w:tcPr>
+            <w:tcW w:type="dxa" w:w="3024"/>
+            <w:vAlign w:val="center"/>
+            <w:shd w:fill="F8FAFC"/>
+          </w:tcPr>
+          <w:p>
+            <w:r/>
+            <w:r>
+              <w:rPr>
+                <w:b w:val="0"/>
+                <w:sz w:val="18"/>
+              </w:rPr>
+              <w:t>ConfiguracionSistema</w:t>
+            </w:r>
+          </w:p>
+        </w:tc>
+        <w:tc>
+          <w:tcPr>
+            <w:tcW w:type="dxa" w:w="6192"/>
+            <w:vAlign w:val="center"/>
+            <w:shd w:fill="F8FAFC"/>
+          </w:tcPr>
+          <w:p>
+            <w:r/>
+            <w:r>
+              <w:rPr>
+                <w:b w:val="0"/>
+                <w:sz w:val="18"/>
+              </w:rPr>
+              <w:t>Datos institucionales, color, ciclo activo y ajustes globales.</w:t>
+            </w:r>
+          </w:p>
+        </w:tc>
+      </w:tr>
+      <w:tr>
+        <w:tc>
+          <w:tcPr>
+            <w:tcW w:type="dxa" w:w="3024"/>
+            <w:vAlign w:val="center"/>
+            <w:shd w:fill="FFFFFF"/>
+          </w:tcPr>
+          <w:p>
+            <w:r/>
+            <w:r>
+              <w:rPr>
+                <w:b w:val="0"/>
+                <w:sz w:val="18"/>
+              </w:rPr>
+              <w:t>Usuarios</w:t>
+            </w:r>
+          </w:p>
+        </w:tc>
+        <w:tc>
+          <w:tcPr>
+            <w:tcW w:type="dxa" w:w="6192"/>
+            <w:vAlign w:val="center"/>
+            <w:shd w:fill="FFFFFF"/>
+          </w:tcPr>
+          <w:p>
+            <w:r/>
+            <w:r>
+              <w:rPr>
+                <w:b w:val="0"/>
+                <w:sz w:val="18"/>
+              </w:rPr>
+              <w:t>Administradores, docentes y otros usuarios internos.</w:t>
+            </w:r>
+          </w:p>
+        </w:tc>
+      </w:tr>
+      <w:tr>
+        <w:tc>
+          <w:tcPr>
+            <w:tcW w:type="dxa" w:w="3024"/>
+            <w:vAlign w:val="center"/>
+            <w:shd w:fill="F8FAFC"/>
+          </w:tcPr>
+          <w:p>
+            <w:r/>
+            <w:r>
+              <w:rPr>
+                <w:b w:val="0"/>
+                <w:sz w:val="18"/>
+              </w:rPr>
+              <w:t>Grupos</w:t>
+            </w:r>
+          </w:p>
+        </w:tc>
+        <w:tc>
+          <w:tcPr>
+            <w:tcW w:type="dxa" w:w="6192"/>
+            <w:vAlign w:val="center"/>
+            <w:shd w:fill="F8FAFC"/>
+          </w:tcPr>
+          <w:p>
+            <w:r/>
+            <w:r>
+              <w:rPr>
+                <w:b w:val="0"/>
+                <w:sz w:val="18"/>
+              </w:rPr>
+              <w:t>Grado, grupo, turno y estado.</w:t>
+            </w:r>
+          </w:p>
+        </w:tc>
+      </w:tr>
+      <w:tr>
+        <w:tc>
+          <w:tcPr>
+            <w:tcW w:type="dxa" w:w="3024"/>
+            <w:vAlign w:val="center"/>
+            <w:shd w:fill="FFFFFF"/>
+          </w:tcPr>
+          <w:p>
+            <w:r/>
+            <w:r>
+              <w:rPr>
+                <w:b w:val="0"/>
+                <w:sz w:val="18"/>
+              </w:rPr>
+              <w:t>Alumnos</w:t>
+            </w:r>
+          </w:p>
+        </w:tc>
+        <w:tc>
+          <w:tcPr>
+            <w:tcW w:type="dxa" w:w="6192"/>
+            <w:vAlign w:val="center"/>
+            <w:shd w:fill="FFFFFF"/>
+          </w:tcPr>
+          <w:p>
+            <w:r/>
+            <w:r>
+              <w:rPr>
+                <w:b w:val="0"/>
+                <w:sz w:val="18"/>
+              </w:rPr>
+              <w:t>Datos del alumno y grupo asignado.</w:t>
+            </w:r>
+          </w:p>
+        </w:tc>
+      </w:tr>
+      <w:tr>
+        <w:tc>
+          <w:tcPr>
+            <w:tcW w:type="dxa" w:w="3024"/>
+            <w:vAlign w:val="center"/>
+            <w:shd w:fill="F8FAFC"/>
+          </w:tcPr>
+          <w:p>
+            <w:r/>
+            <w:r>
+              <w:rPr>
+                <w:b w:val="0"/>
+                <w:sz w:val="18"/>
+              </w:rPr>
+              <w:t>Asignaciones</w:t>
+            </w:r>
+          </w:p>
+        </w:tc>
+        <w:tc>
+          <w:tcPr>
+            <w:tcW w:type="dxa" w:w="6192"/>
+            <w:vAlign w:val="center"/>
+            <w:shd w:fill="F8FAFC"/>
+          </w:tcPr>
+          <w:p>
+            <w:r/>
+            <w:r>
+              <w:rPr>
+                <w:b w:val="0"/>
+                <w:sz w:val="18"/>
+              </w:rPr>
+              <w:t>Relación maestro-grupo-materia.</w:t>
+            </w:r>
+          </w:p>
+        </w:tc>
+      </w:tr>
+      <w:tr>
+        <w:tc>
+          <w:tcPr>
+            <w:tcW w:type="dxa" w:w="3024"/>
+            <w:vAlign w:val="center"/>
+            <w:shd w:fill="FFFFFF"/>
+          </w:tcPr>
+          <w:p>
+            <w:r/>
+            <w:r>
+              <w:rPr>
+                <w:b w:val="0"/>
+                <w:sz w:val="18"/>
+              </w:rPr>
+              <w:t>CiclosEscolares / PeriodosEvaluacion</w:t>
+            </w:r>
+          </w:p>
+        </w:tc>
+        <w:tc>
+          <w:tcPr>
+            <w:tcW w:type="dxa" w:w="6192"/>
+            <w:vAlign w:val="center"/>
+            <w:shd w:fill="FFFFFF"/>
+          </w:tcPr>
+          <w:p>
+            <w:r/>
+            <w:r>
+              <w:rPr>
+                <w:b w:val="0"/>
+                <w:sz w:val="18"/>
+              </w:rPr>
+              <w:t>Ciclos y periodos de evaluación activos.</w:t>
+            </w:r>
+          </w:p>
+        </w:tc>
+      </w:tr>
+      <w:tr>
+        <w:tc>
+          <w:tcPr>
+            <w:tcW w:type="dxa" w:w="3024"/>
+            <w:vAlign w:val="center"/>
+            <w:shd w:fill="F8FAFC"/>
+          </w:tcPr>
+          <w:p>
+            <w:r/>
+            <w:r>
+              <w:rPr>
+                <w:b w:val="0"/>
+                <w:sz w:val="18"/>
+              </w:rPr>
+              <w:t>Calificaciones / Asistencias</w:t>
+            </w:r>
+          </w:p>
+        </w:tc>
+        <w:tc>
+          <w:tcPr>
+            <w:tcW w:type="dxa" w:w="6192"/>
+            <w:vAlign w:val="center"/>
+            <w:shd w:fill="F8FAFC"/>
+          </w:tcPr>
+          <w:p>
+            <w:r/>
+            <w:r>
+              <w:rPr>
+                <w:b w:val="0"/>
+                <w:sz w:val="18"/>
+              </w:rPr>
+              <w:t>Registros académicos principales.</w:t>
+            </w:r>
+          </w:p>
+        </w:tc>
+      </w:tr>
+      <w:tr>
+        <w:tc>
+          <w:tcPr>
+            <w:tcW w:type="dxa" w:w="3024"/>
+            <w:vAlign w:val="center"/>
+            <w:shd w:fill="FFFFFF"/>
+          </w:tcPr>
+          <w:p>
+            <w:r/>
+            <w:r>
+              <w:rPr>
+                <w:b w:val="0"/>
+                <w:sz w:val="18"/>
+              </w:rPr>
+              <w:t>Avisos / Planeaciones</w:t>
+            </w:r>
+          </w:p>
+        </w:tc>
+        <w:tc>
+          <w:tcPr>
+            <w:tcW w:type="dxa" w:w="6192"/>
+            <w:vAlign w:val="center"/>
+            <w:shd w:fill="FFFFFF"/>
+          </w:tcPr>
+          <w:p>
+            <w:r/>
+            <w:r>
+              <w:rPr>
+                <w:b w:val="0"/>
+                <w:sz w:val="18"/>
+              </w:rPr>
+              <w:t>Comunicación institucional y archivos docentes.</w:t>
+            </w:r>
+          </w:p>
+        </w:tc>
+      </w:tr>
+      <w:tr>
+        <w:tc>
+          <w:tcPr>
+            <w:tcW w:type="dxa" w:w="3024"/>
+            <w:vAlign w:val="center"/>
+            <w:shd w:fill="F8FAFC"/>
+          </w:tcPr>
+          <w:p>
+            <w:r/>
+            <w:r>
+              <w:rPr>
+                <w:b w:val="0"/>
+                <w:sz w:val="18"/>
+              </w:rPr>
+              <w:t>BitacoraMovimientos / IntentosSeguridad</w:t>
+            </w:r>
+          </w:p>
+        </w:tc>
+        <w:tc>
+          <w:tcPr>
+            <w:tcW w:type="dxa" w:w="6192"/>
+            <w:vAlign w:val="center"/>
+            <w:shd w:fill="F8FAFC"/>
+          </w:tcPr>
+          <w:p>
+            <w:r/>
+            <w:r>
+              <w:rPr>
+                <w:b w:val="0"/>
+                <w:sz w:val="18"/>
+              </w:rPr>
+              <w:t>Auditoría básica y control de intentos públicos.</w:t>
+            </w:r>
+          </w:p>
+        </w:tc>
+      </w:tr>
+    </w:tbl>
+    <w:p/>
+    <w:p>
+      <w:pPr>
+        <w:pStyle w:val="Heading1"/>
+      </w:pPr>
+      <w:r>
+        <w:rPr>
+          <w:b/>
+          <w:color w:val="97051E"/>
+        </w:rPr>
+        <w:t>9. Importaciones y formatos</w:t>
+      </w:r>
+    </w:p>
+    <w:p>
+      <w:r>
+        <w:t>Las importaciones requieren formularios multipart/form-data y una carpeta temporal de PHP válida. Si aparece un error de subida antes de leer el archivo, revisar upload_tmp_dir o /tmp en Linux.</w:t>
+      </w:r>
+    </w:p>
+    <w:tbl>
+      <w:tblPr>
+        <w:tblStyle w:val="TableGrid"/>
+        <w:tblW w:type="auto" w:w="0"/>
+        <w:jc w:val="center"/>
+        <w:tblLook w:firstColumn="1" w:firstRow="1" w:lastColumn="0" w:lastRow="0" w:noHBand="0" w:noVBand="1" w:val="04A0"/>
+      </w:tblPr>
+      <w:tblGrid>
+        <w:gridCol w:w="5112"/>
+        <w:gridCol w:w="5112"/>
+      </w:tblGrid>
+      <w:tr>
+        <w:tc>
+          <w:tcPr>
+            <w:tcW w:type="dxa" w:w="2448"/>
+            <w:shd w:fill="97051E"/>
+            <w:vAlign w:val="center"/>
+          </w:tcPr>
+          <w:p>
+            <w:r/>
+            <w:r>
+              <w:rPr>
+                <w:b/>
+                <w:color w:val="FFFFFF"/>
+                <w:sz w:val="18"/>
+              </w:rPr>
+              <w:t>Importación</w:t>
+            </w:r>
+          </w:p>
+        </w:tc>
+        <w:tc>
+          <w:tcPr>
+            <w:tcW w:type="dxa" w:w="6768"/>
+            <w:shd w:fill="97051E"/>
+            <w:vAlign w:val="center"/>
+          </w:tcPr>
+          <w:p>
+            <w:r/>
+            <w:r>
+              <w:rPr>
+                <w:b/>
+                <w:color w:val="FFFFFF"/>
+                <w:sz w:val="18"/>
+              </w:rPr>
+              <w:t>Campos esperados</w:t>
+            </w:r>
+          </w:p>
+        </w:tc>
+      </w:tr>
+      <w:tr>
+        <w:tc>
+          <w:tcPr>
+            <w:tcW w:type="dxa" w:w="2448"/>
+            <w:vAlign w:val="center"/>
+            <w:shd w:fill="F8FAFC"/>
+          </w:tcPr>
+          <w:p>
+            <w:r/>
+            <w:r>
+              <w:rPr>
+                <w:b w:val="0"/>
+                <w:sz w:val="18"/>
+              </w:rPr>
+              <w:t>Docentes</w:t>
+            </w:r>
+          </w:p>
+        </w:tc>
+        <w:tc>
+          <w:tcPr>
+            <w:tcW w:type="dxa" w:w="6768"/>
+            <w:vAlign w:val="center"/>
+            <w:shd w:fill="F8FAFC"/>
+          </w:tcPr>
+          <w:p>
+            <w:r/>
+            <w:r>
+              <w:rPr>
+                <w:b w:val="0"/>
+                <w:sz w:val="18"/>
+              </w:rPr>
+              <w:t>Nombre, Usuario y Contraseña. El sistema normaliza nombres y crea usuarios docentes.</w:t>
+            </w:r>
+          </w:p>
+        </w:tc>
+      </w:tr>
+      <w:tr>
+        <w:tc>
+          <w:tcPr>
+            <w:tcW w:type="dxa" w:w="2448"/>
+            <w:vAlign w:val="center"/>
+            <w:shd w:fill="FFFFFF"/>
+          </w:tcPr>
+          <w:p>
+            <w:r/>
+            <w:r>
+              <w:rPr>
+                <w:b w:val="0"/>
+                <w:sz w:val="18"/>
+              </w:rPr>
+              <w:t>Grupos</w:t>
+            </w:r>
+          </w:p>
+        </w:tc>
+        <w:tc>
+          <w:tcPr>
+            <w:tcW w:type="dxa" w:w="6768"/>
+            <w:vAlign w:val="center"/>
+            <w:shd w:fill="FFFFFF"/>
+          </w:tcPr>
+          <w:p>
+            <w:r/>
+            <w:r>
+              <w:rPr>
+                <w:b w:val="0"/>
+                <w:sz w:val="18"/>
+              </w:rPr>
+              <w:t>Grado, Grupo y Turno. Grado numérico, grupo en letras y turno MATUTINO/VESPERTINO.</w:t>
+            </w:r>
+          </w:p>
+        </w:tc>
+      </w:tr>
+      <w:tr>
+        <w:tc>
+          <w:tcPr>
+            <w:tcW w:type="dxa" w:w="2448"/>
+            <w:vAlign w:val="center"/>
+            <w:shd w:fill="F8FAFC"/>
+          </w:tcPr>
+          <w:p>
+            <w:r/>
+            <w:r>
+              <w:rPr>
+                <w:b w:val="0"/>
+                <w:sz w:val="18"/>
+              </w:rPr>
+              <w:t>Alumnos</w:t>
+            </w:r>
+          </w:p>
+        </w:tc>
+        <w:tc>
+          <w:tcPr>
+            <w:tcW w:type="dxa" w:w="6768"/>
+            <w:vAlign w:val="center"/>
+            <w:shd w:fill="F8FAFC"/>
+          </w:tcPr>
+          <w:p>
+            <w:r/>
+            <w:r>
+              <w:rPr>
+                <w:b w:val="0"/>
+                <w:sz w:val="18"/>
+              </w:rPr>
+              <w:t>Datos de alumno vinculados al grupo seleccionado. Revisar grupo antes de importar.</w:t>
+            </w:r>
+          </w:p>
+        </w:tc>
+      </w:tr>
+      <w:tr>
+        <w:tc>
+          <w:tcPr>
+            <w:tcW w:type="dxa" w:w="2448"/>
+            <w:vAlign w:val="center"/>
+            <w:shd w:fill="FFFFFF"/>
+          </w:tcPr>
+          <w:p>
+            <w:r/>
+            <w:r>
+              <w:rPr>
+                <w:b w:val="0"/>
+                <w:sz w:val="18"/>
+              </w:rPr>
+              <w:t>Respaldos SGCE</w:t>
+            </w:r>
+          </w:p>
+        </w:tc>
+        <w:tc>
+          <w:tcPr>
+            <w:tcW w:type="dxa" w:w="6768"/>
+            <w:vAlign w:val="center"/>
+            <w:shd w:fill="FFFFFF"/>
+          </w:tcPr>
+          <w:p>
+            <w:r/>
+            <w:r>
+              <w:rPr>
+                <w:b w:val="0"/>
+                <w:sz w:val="18"/>
+              </w:rPr>
+              <w:t>Solo archivos generados por Exportar datos SGCE. Se rechaza SQL externo o estructura no firmada.</w:t>
+            </w:r>
+          </w:p>
+        </w:tc>
+      </w:tr>
+    </w:tbl>
+    <w:p/>
+    <w:p>
+      <w:pPr>
+        <w:pStyle w:val="Heading1"/>
+      </w:pPr>
+      <w:r>
+        <w:rPr>
+          <w:b/>
+          <w:color w:val="97051E"/>
+        </w:rPr>
+        <w:t>10. Respaldos, restauración y cron</w:t>
+      </w:r>
+    </w:p>
+    <w:p>
+      <w:pPr>
+        <w:pStyle w:val="ListBullet"/>
+      </w:pPr>
+      <w:r>
+        <w:t>ExportarDatosBD genera respaldos de datos escolares del propio SGCE.</w:t>
+      </w:r>
+    </w:p>
+    <w:p>
+      <w:pPr>
+        <w:pStyle w:val="ListBullet"/>
+      </w:pPr>
+      <w:r>
+        <w:t>RestaurarBD valida firma y evita importar SQL externo peligroso.</w:t>
+      </w:r>
+    </w:p>
+    <w:p>
+      <w:pPr>
+        <w:pStyle w:val="ListBullet"/>
+      </w:pPr>
+      <w:r>
+        <w:t>Al reemplazar datos escolares, se limpian ciclos y periodos para evitar cruces de información.</w:t>
+      </w:r>
+    </w:p>
+    <w:p>
+      <w:pPr>
+        <w:pStyle w:val="ListBullet"/>
+      </w:pPr>
+      <w:r>
+        <w:t>Los cron backup_diario.php y backup_semanal.php usan locks para evitar ejecuciones simultáneas.</w:t>
+      </w:r>
+    </w:p>
+    <w:p>
+      <w:pPr>
+        <w:pStyle w:val="Heading1"/>
+      </w:pPr>
+      <w:r>
+        <w:rPr>
+          <w:b/>
+          <w:color w:val="97051E"/>
+        </w:rPr>
+        <w:t>11. Seguridad aplicada</w:t>
+      </w:r>
+    </w:p>
+    <w:p>
+      <w:pPr>
+        <w:pStyle w:val="ListBullet"/>
+      </w:pPr>
+      <w:r>
+        <w:t>Sesiones con cookie HttpOnly, SameSite Strict y token de sesión persistente.</w:t>
+      </w:r>
+    </w:p>
+    <w:p>
+      <w:pPr>
+        <w:pStyle w:val="ListBullet"/>
+      </w:pPr>
+      <w:r>
+        <w:t>CSRF en formularios internos y públicos.</w:t>
+      </w:r>
+    </w:p>
+    <w:p>
+      <w:pPr>
+        <w:pStyle w:val="ListBullet"/>
+      </w:pPr>
+      <w:r>
+        <w:t>Rate limit en consultas públicas para reducir abuso.</w:t>
+      </w:r>
+    </w:p>
+    <w:p>
+      <w:pPr>
+        <w:pStyle w:val="ListBullet"/>
+      </w:pPr>
+      <w:r>
+        <w:t>Protección .htaccess contra acceso a SQL, ZIP, logs, MD, DM, README, MANIFEST y archivos sensibles.</w:t>
+      </w:r>
+    </w:p>
+    <w:p>
+      <w:pPr>
+        <w:pStyle w:val="ListBullet"/>
+      </w:pPr>
+      <w:r>
+        <w:t>Descarga de planeaciones validando propietario o rol autorizado.</w:t>
+      </w:r>
+    </w:p>
+    <w:p>
+      <w:pPr>
+        <w:pStyle w:val="ListBullet"/>
+      </w:pPr>
+      <w:r>
+        <w:t>Consultas públicas por coincidencia exacta de datos; no exponen listados completos de alumnos.</w:t>
+      </w:r>
+    </w:p>
+    <w:p>
+      <w:pPr>
+        <w:pStyle w:val="Heading1"/>
+      </w:pPr>
+      <w:r>
+        <w:rPr>
+          <w:b/>
+          <w:color w:val="97051E"/>
+        </w:rPr>
+        <w:t>12. Checklist final de pruebas</w:t>
+      </w:r>
+    </w:p>
+    <w:p>
+      <w:pPr>
+        <w:ind w:left="360" w:hanging="360"/>
+      </w:pPr>
+      <w:r>
+        <w:rPr>
+          <w:b/>
+          <w:sz w:val="20"/>
+        </w:rPr>
+        <w:t xml:space="preserve">1. </w:t>
+      </w:r>
+      <w:r>
+        <w:rPr>
+          <w:sz w:val="20"/>
+        </w:rPr>
+        <w:t>Instalar desde cero en una base vacía.</w:t>
+      </w:r>
+    </w:p>
+    <w:p>
+      <w:pPr>
+        <w:ind w:left="360" w:hanging="360"/>
+      </w:pPr>
+      <w:r>
+        <w:rPr>
+          <w:b/>
+          <w:sz w:val="20"/>
+        </w:rPr>
+        <w:t xml:space="preserve">2. </w:t>
+      </w:r>
+      <w:r>
+        <w:rPr>
+          <w:sz w:val="20"/>
+        </w:rPr>
+        <w:t>Entrar como administrador y cambiar color institucional; cerrar sesión y validar el login.</w:t>
+      </w:r>
+    </w:p>
+    <w:p>
+      <w:pPr>
+        <w:ind w:left="360" w:hanging="360"/>
+      </w:pPr>
+      <w:r>
+        <w:rPr>
+          <w:b/>
+          <w:sz w:val="20"/>
+        </w:rPr>
+        <w:t xml:space="preserve">3. </w:t>
+      </w:r>
+      <w:r>
+        <w:rPr>
+          <w:sz w:val="20"/>
+        </w:rPr>
+        <w:t>Registrar/importar maestros, grupos y alumnos.</w:t>
+      </w:r>
+    </w:p>
+    <w:p>
+      <w:pPr>
+        <w:ind w:left="360" w:hanging="360"/>
+      </w:pPr>
+      <w:r>
+        <w:rPr>
+          <w:b/>
+          <w:sz w:val="20"/>
+        </w:rPr>
+        <w:t xml:space="preserve">4. </w:t>
+      </w:r>
+      <w:r>
+        <w:rPr>
+          <w:sz w:val="20"/>
+        </w:rPr>
+        <w:t>Crear asignaciones y entrar como docente.</w:t>
+      </w:r>
+    </w:p>
+    <w:p>
+      <w:pPr>
+        <w:ind w:left="360" w:hanging="360"/>
+      </w:pPr>
+      <w:r>
+        <w:rPr>
+          <w:b/>
+          <w:sz w:val="20"/>
+        </w:rPr>
+        <w:t xml:space="preserve">5. </w:t>
+      </w:r>
+      <w:r>
+        <w:rPr>
+          <w:sz w:val="20"/>
+        </w:rPr>
+        <w:t>Pasar asistencia y comprobar contadores.</w:t>
+      </w:r>
+    </w:p>
+    <w:p>
+      <w:pPr>
+        <w:ind w:left="360" w:hanging="360"/>
+      </w:pPr>
+      <w:r>
+        <w:rPr>
+          <w:b/>
+          <w:sz w:val="20"/>
+        </w:rPr>
+        <w:t xml:space="preserve">6. </w:t>
+      </w:r>
+      <w:r>
+        <w:rPr>
+          <w:sz w:val="20"/>
+        </w:rPr>
+        <w:t>Capturar calificaciones y exportar PDF/Excel.</w:t>
+      </w:r>
+    </w:p>
+    <w:p>
+      <w:pPr>
+        <w:ind w:left="360" w:hanging="360"/>
+      </w:pPr>
+      <w:r>
+        <w:rPr>
+          <w:b/>
+          <w:sz w:val="20"/>
+        </w:rPr>
+        <w:t xml:space="preserve">7. </w:t>
+      </w:r>
+      <w:r>
+        <w:rPr>
+          <w:sz w:val="20"/>
+        </w:rPr>
+        <w:t>Subir, revisar, aprobar y devolver planeaciones.</w:t>
+      </w:r>
+    </w:p>
+    <w:p>
+      <w:pPr>
+        <w:ind w:left="360" w:hanging="360"/>
+      </w:pPr>
+      <w:r>
+        <w:rPr>
+          <w:b/>
+          <w:sz w:val="20"/>
+        </w:rPr>
+        <w:t xml:space="preserve">8. </w:t>
+      </w:r>
+      <w:r>
+        <w:rPr>
+          <w:sz w:val="20"/>
+        </w:rPr>
+        <w:t>Crear avisos para todos, maestros y padres.</w:t>
+      </w:r>
+    </w:p>
+    <w:p>
+      <w:pPr>
+        <w:ind w:left="360" w:hanging="360"/>
+      </w:pPr>
+      <w:r>
+        <w:rPr>
+          <w:b/>
+          <w:sz w:val="20"/>
+        </w:rPr>
+        <w:t xml:space="preserve">9. </w:t>
+      </w:r>
+      <w:r>
+        <w:rPr>
+          <w:sz w:val="20"/>
+        </w:rPr>
+        <w:t>Probar consulta pública de asistencia y calificaciones.</w:t>
+      </w:r>
+    </w:p>
+    <w:p>
+      <w:pPr>
+        <w:ind w:left="360" w:hanging="360"/>
+      </w:pPr>
+      <w:r>
+        <w:rPr>
+          <w:b/>
+          <w:sz w:val="20"/>
+        </w:rPr>
+        <w:t xml:space="preserve">10. </w:t>
+      </w:r>
+      <w:r>
+        <w:rPr>
+          <w:sz w:val="20"/>
+        </w:rPr>
+        <w:t>Generar respaldo y restaurarlo en una instalación de prueba.</w:t>
+      </w:r>
+    </w:p>
+    <w:p>
+      <w:pPr>
+        <w:ind w:left="360" w:hanging="360"/>
+      </w:pPr>
+      <w:r>
+        <w:rPr>
+          <w:b/>
+          <w:sz w:val="20"/>
+        </w:rPr>
+        <w:t xml:space="preserve">11. </w:t>
+      </w:r>
+      <w:r>
+        <w:rPr>
+          <w:sz w:val="20"/>
+        </w:rPr>
+        <w:t>Revisar responsive en celular, tablet y escritorio.</w:t>
+      </w:r>
+    </w:p>
+    <w:p>
+      <w:pPr>
+        <w:pStyle w:val="Heading1"/>
+      </w:pPr>
+      <w:r>
+        <w:rPr>
+          <w:b/>
+          <w:color w:val="97051E"/>
+        </w:rPr>
+        <w:t>13. Solución rápida de problemas</w:t>
+      </w:r>
+    </w:p>
+    <w:tbl>
+      <w:tblPr>
+        <w:tblStyle w:val="TableGrid"/>
+        <w:tblW w:type="auto" w:w="0"/>
+        <w:jc w:val="center"/>
+        <w:tblLook w:firstColumn="1" w:firstRow="1" w:lastColumn="0" w:lastRow="0" w:noHBand="0" w:noVBand="1" w:val="04A0"/>
+      </w:tblPr>
+      <w:tblGrid>
+        <w:gridCol w:w="5112"/>
+        <w:gridCol w:w="5112"/>
+      </w:tblGrid>
+      <w:tr>
+        <w:tc>
+          <w:tcPr>
+            <w:tcW w:type="dxa" w:w="2880"/>
+            <w:shd w:fill="97051E"/>
+            <w:vAlign w:val="center"/>
+          </w:tcPr>
+          <w:p>
+            <w:r/>
+            <w:r>
+              <w:rPr>
+                <w:b/>
+                <w:color w:val="FFFFFF"/>
+                <w:sz w:val="18"/>
+              </w:rPr>
+              <w:t>Problema</w:t>
+            </w:r>
+          </w:p>
+        </w:tc>
+        <w:tc>
+          <w:tcPr>
+            <w:tcW w:type="dxa" w:w="6336"/>
+            <w:shd w:fill="97051E"/>
+            <w:vAlign w:val="center"/>
+          </w:tcPr>
+          <w:p>
+            <w:r/>
+            <w:r>
+              <w:rPr>
+                <w:b/>
+                <w:color w:val="FFFFFF"/>
+                <w:sz w:val="18"/>
+              </w:rPr>
+              <w:t>Revisión recomendada</w:t>
+            </w:r>
+          </w:p>
+        </w:tc>
+      </w:tr>
+      <w:tr>
+        <w:tc>
+          <w:tcPr>
+            <w:tcW w:type="dxa" w:w="2880"/>
+            <w:vAlign w:val="center"/>
+            <w:shd w:fill="F8FAFC"/>
+          </w:tcPr>
+          <w:p>
+            <w:r/>
+            <w:r>
+              <w:rPr>
+                <w:b w:val="0"/>
+                <w:sz w:val="18"/>
+              </w:rPr>
+              <w:t>Error al subir archivo</w:t>
+            </w:r>
+          </w:p>
+        </w:tc>
+        <w:tc>
+          <w:tcPr>
+            <w:tcW w:type="dxa" w:w="6336"/>
+            <w:vAlign w:val="center"/>
+            <w:shd w:fill="F8FAFC"/>
+          </w:tcPr>
+          <w:p>
+            <w:r/>
+            <w:r>
+              <w:rPr>
+                <w:b w:val="0"/>
+                <w:sz w:val="18"/>
+              </w:rPr>
+              <w:t>Verificar file_uploads, upload_tmp_dir y permisos de /tmp o storage/tmp_uploads.</w:t>
+            </w:r>
+          </w:p>
+        </w:tc>
+      </w:tr>
+      <w:tr>
+        <w:tc>
+          <w:tcPr>
+            <w:tcW w:type="dxa" w:w="2880"/>
+            <w:vAlign w:val="center"/>
+            <w:shd w:fill="FFFFFF"/>
+          </w:tcPr>
+          <w:p>
+            <w:r/>
+            <w:r>
+              <w:rPr>
+                <w:b w:val="0"/>
+                <w:sz w:val="18"/>
+              </w:rPr>
+              <w:t>CSS no cambia</w:t>
+            </w:r>
+          </w:p>
+        </w:tc>
+        <w:tc>
+          <w:tcPr>
+            <w:tcW w:type="dxa" w:w="6336"/>
+            <w:vAlign w:val="center"/>
+            <w:shd w:fill="FFFFFF"/>
+          </w:tcPr>
+          <w:p>
+            <w:r/>
+            <w:r>
+              <w:rPr>
+                <w:b w:val="0"/>
+                <w:sz w:val="18"/>
+              </w:rPr>
+              <w:t>Hacer Ctrl+F5 y confirmar que el enlace use cache=sgce2026.</w:t>
+            </w:r>
+          </w:p>
+        </w:tc>
+      </w:tr>
+      <w:tr>
+        <w:tc>
+          <w:tcPr>
+            <w:tcW w:type="dxa" w:w="2880"/>
+            <w:vAlign w:val="center"/>
+            <w:shd w:fill="F8FAFC"/>
+          </w:tcPr>
+          <w:p>
+            <w:r/>
+            <w:r>
+              <w:rPr>
+                <w:b w:val="0"/>
+                <w:sz w:val="18"/>
+              </w:rPr>
+              <w:t>Error de conexión</w:t>
+            </w:r>
+          </w:p>
+        </w:tc>
+        <w:tc>
+          <w:tcPr>
+            <w:tcW w:type="dxa" w:w="6336"/>
+            <w:vAlign w:val="center"/>
+            <w:shd w:fill="F8FAFC"/>
+          </w:tcPr>
+          <w:p>
+            <w:r/>
+            <w:r>
+              <w:rPr>
+                <w:b w:val="0"/>
+                <w:sz w:val="18"/>
+              </w:rPr>
+              <w:t>Validar host, base, usuario, contraseña y permisos MySQL.</w:t>
+            </w:r>
+          </w:p>
+        </w:tc>
+      </w:tr>
+      <w:tr>
+        <w:tc>
+          <w:tcPr>
+            <w:tcW w:type="dxa" w:w="2880"/>
+            <w:vAlign w:val="center"/>
+            <w:shd w:fill="FFFFFF"/>
+          </w:tcPr>
+          <w:p>
+            <w:r/>
+            <w:r>
+              <w:rPr>
+                <w:b w:val="0"/>
+                <w:sz w:val="18"/>
+              </w:rPr>
+              <w:t>PDF no descarga</w:t>
+            </w:r>
+          </w:p>
+        </w:tc>
+        <w:tc>
+          <w:tcPr>
+            <w:tcW w:type="dxa" w:w="6336"/>
+            <w:vAlign w:val="center"/>
+            <w:shd w:fill="FFFFFF"/>
+          </w:tcPr>
+          <w:p>
+            <w:r/>
+            <w:r>
+              <w:rPr>
+                <w:b w:val="0"/>
+                <w:sz w:val="18"/>
+              </w:rPr>
+              <w:t>Revisar permisos, sesión y que no existan salidas antes de los headers.</w:t>
+            </w:r>
+          </w:p>
+        </w:tc>
+      </w:tr>
+      <w:tr>
+        <w:tc>
+          <w:tcPr>
+            <w:tcW w:type="dxa" w:w="2880"/>
+            <w:vAlign w:val="center"/>
+            <w:shd w:fill="F8FAFC"/>
+          </w:tcPr>
+          <w:p>
+            <w:r/>
+            <w:r>
+              <w:rPr>
+                <w:b w:val="0"/>
+                <w:sz w:val="18"/>
+              </w:rPr>
+              <w:t>Restauración rechazada</w:t>
+            </w:r>
+          </w:p>
+        </w:tc>
+        <w:tc>
+          <w:tcPr>
+            <w:tcW w:type="dxa" w:w="6336"/>
+            <w:vAlign w:val="center"/>
+            <w:shd w:fill="F8FAFC"/>
+          </w:tcPr>
+          <w:p>
+            <w:r/>
+            <w:r>
+              <w:rPr>
+                <w:b w:val="0"/>
+                <w:sz w:val="18"/>
+              </w:rPr>
+              <w:t>Usar únicamente respaldos generados por SGCE.</w:t>
+            </w:r>
+          </w:p>
+        </w:tc>
+      </w:tr>
+    </w:tbl>
+    <w:p/>
     <w:sectPr>
       <w:pgSz w:w="12240" w:h="15840"/>
       <w:pgMar w:top="936" w:right="1008" w:bottom="936" w:left="1008" w:header="720" w:footer="720" w:gutter="0"/>
@@ -765,7 +3186,7 @@
     <w:qFormat/>
     <w:rsid w:val="00FC693F"/>
     <w:rPr>
-      <w:rFonts w:ascii="Arial" w:hAnsi="Arial"/>
+      <w:rFonts w:ascii="Aptos" w:hAnsi="Aptos"/>
       <w:sz w:val="20"/>
     </w:rPr>
   </w:style>
@@ -828,11 +3249,11 @@
       <w:outlineLvl w:val="0"/>
     </w:pPr>
     <w:rPr>
-      <w:rFonts w:asciiTheme="majorHAnsi" w:eastAsiaTheme="majorEastAsia" w:hAnsiTheme="majorHAnsi" w:cstheme="majorBidi" w:ascii="Arial" w:hAnsi="Arial"/>
+      <w:rFonts w:asciiTheme="majorHAnsi" w:eastAsiaTheme="majorEastAsia" w:hAnsiTheme="majorHAnsi" w:cstheme="majorBidi" w:ascii="Aptos Display" w:hAnsi="Aptos Display"/>
       <w:b/>
       <w:bCs/>
-      <w:color w:val="365F91" w:themeColor="accent1" w:themeShade="BF"/>
-      <w:sz w:val="28"/>
+      <w:color w:val="1F2937"/>
+      <w:sz w:val="36"/>
       <w:szCs w:val="28"/>
     </w:rPr>
   </w:style>
@@ -852,10 +3273,10 @@
       <w:outlineLvl w:val="1"/>
     </w:pPr>
     <w:rPr>
-      <w:rFonts w:asciiTheme="majorHAnsi" w:eastAsiaTheme="majorEastAsia" w:hAnsiTheme="majorHAnsi" w:cstheme="majorBidi" w:ascii="Arial" w:hAnsi="Arial"/>
+      <w:rFonts w:asciiTheme="majorHAnsi" w:eastAsiaTheme="majorEastAsia" w:hAnsiTheme="majorHAnsi" w:cstheme="majorBidi" w:ascii="Aptos Display" w:hAnsi="Aptos Display"/>
       <w:b/>
       <w:bCs/>
-      <w:color w:val="4F81BD" w:themeColor="accent1"/>
+      <w:color w:val="1F2937"/>
       <w:sz w:val="26"/>
       <w:szCs w:val="26"/>
     </w:rPr>
@@ -876,10 +3297,11 @@
       <w:outlineLvl w:val="2"/>
     </w:pPr>
     <w:rPr>
-      <w:rFonts w:asciiTheme="majorHAnsi" w:eastAsiaTheme="majorEastAsia" w:hAnsiTheme="majorHAnsi" w:cstheme="majorBidi" w:ascii="Arial" w:hAnsi="Arial"/>
+      <w:rFonts w:asciiTheme="majorHAnsi" w:eastAsiaTheme="majorEastAsia" w:hAnsiTheme="majorHAnsi" w:cstheme="majorBidi" w:ascii="Aptos Display" w:hAnsi="Aptos Display"/>
       <w:b/>
       <w:bCs/>
-      <w:color w:val="4F81BD" w:themeColor="accent1"/>
+      <w:color w:val="1F2937"/>
+      <w:sz w:val="22"/>
     </w:rPr>
   </w:style>
   <w:style w:type="paragraph" w:styleId="Heading4">

</xml_diff>

<commit_message>
Version Final en Diseño
</commit_message>
<xml_diff>
--- a/docs/MANUAL_TECNICO_INSTALACION_SGCE.docx
+++ b/docs/MANUAL_TECNICO_INSTALACION_SGCE.docx
@@ -49,7 +49,7 @@
           <w:color w:val="667085"/>
           <w:sz w:val="18"/>
         </w:rPr>
-        <w:t>Versión limpia para instalación desde cero - 2026-05-29</w:t>
+        <w:t>Versión final auditada para instalación desde cero - 2026-05-31</w:t>
       </w:r>
     </w:p>
     <w:p/>
@@ -474,13 +474,14 @@
             <w:shd w:fill="F8FAFC"/>
           </w:tcPr>
           <w:p>
-            <w:r/>
+            <w:r>
+              <w:t>Estilos y scripts del sistema. Los cache busting usan cache=sgce2026final.</w:t>
+            </w:r>
             <w:r>
               <w:rPr>
                 <w:b w:val="0"/>
                 <w:sz w:val="18"/>
               </w:rPr>
-              <w:t>Estilos y scripts del sistema. Los cache busting usan cache=sgce2026.</w:t>
             </w:r>
           </w:p>
         </w:tc>
@@ -2691,13 +2692,14 @@
             <w:shd w:fill="FFFFFF"/>
           </w:tcPr>
           <w:p>
-            <w:r/>
+            <w:r>
+              <w:t>Hacer Ctrl+F5 y confirmar que el enlace use cache=sgce2026final.</w:t>
+            </w:r>
             <w:r>
               <w:rPr>
                 <w:b w:val="0"/>
                 <w:sz w:val="18"/>
               </w:rPr>
-              <w:t>Hacer Ctrl+F5 y confirmar que el enlace use cache=sgce2026.</w:t>
             </w:r>
           </w:p>
         </w:tc>

</xml_diff>